<commit_message>
Plano das aulas (CONTEXTO.txt), Aula 02 e resumo atualizado
Co-Authored-By: Claude Opus 5.5 <noreply@anthropic.com>
Claude-Session: https://claude.ai/code/session_01CYs6vUMBFtjcCxFJC5XwZi
</commit_message>
<xml_diff>
--- a/Resumo_Banco_de_Dados.docx
+++ b/Resumo_Banco_de_Dados.docx
@@ -1454,6 +1454,535 @@
     </w:p>
     <w:p>
       <w:pPr>
+        <w:pStyle w:val="Heading2"/>
+      </w:pPr>
+      <w:r>
+        <w:t xml:space="preserve">7. O que o professor acrescenta (Aula 06 dele)</w:t>
+      </w:r>
+    </w:p>
+    <w:p>
+      <w:pPr>
+        <w:spacing w:after="120"/>
+      </w:pPr>
+      <w:r>
+        <w:rPr>
+          <w:b/>
+          <w:bCs/>
+        </w:rPr>
+        <w:t xml:space="preserve">Fases de um projeto de banco de dados:</w:t>
+      </w:r>
+      <w:r>
+        <w:t xml:space="preserve"> Projeto </w:t>
+      </w:r>
+      <w:r>
+        <w:rPr>
+          <w:b/>
+          <w:bCs/>
+        </w:rPr>
+        <w:t xml:space="preserve">Conceitual</w:t>
+      </w:r>
+      <w:r>
+        <w:t xml:space="preserve"> (o que o negócio precisa) → Projeto </w:t>
+      </w:r>
+      <w:r>
+        <w:rPr>
+          <w:b/>
+          <w:bCs/>
+        </w:rPr>
+        <w:t xml:space="preserve">Lógico</w:t>
+      </w:r>
+      <w:r>
+        <w:t xml:space="preserve"> (tabelas, colunas e relacionamentos) → Projeto </w:t>
+      </w:r>
+      <w:r>
+        <w:rPr>
+          <w:b/>
+          <w:bCs/>
+        </w:rPr>
+        <w:t xml:space="preserve">Físico</w:t>
+      </w:r>
+      <w:r>
+        <w:t xml:space="preserve"> (os comandos SQL no banco escolhido).</w:t>
+      </w:r>
+    </w:p>
+    <w:p>
+      <w:pPr>
+        <w:spacing w:after="120"/>
+      </w:pPr>
+      <w:r>
+        <w:rPr>
+          <w:b/>
+          <w:bCs/>
+        </w:rPr>
+        <w:t xml:space="preserve">SQL</w:t>
+      </w:r>
+      <w:r>
+        <w:t xml:space="preserve"> (Structured Query Language) é a linguagem padrão dos bancos relacionais (padrão ISO desde a década de 80). Ela se divide em grupos:</w:t>
+      </w:r>
+    </w:p>
+    <w:tbl>
+      <w:tblPr>
+        <w:tblW w:type="dxa" w:w="9026"/>
+        <w:tblBorders>
+          <w:top w:val="single" w:color="auto" w:sz="4"/>
+          <w:left w:val="single" w:color="auto" w:sz="4"/>
+          <w:bottom w:val="single" w:color="auto" w:sz="4"/>
+          <w:right w:val="single" w:color="auto" w:sz="4"/>
+          <w:insideH w:val="single" w:color="auto" w:sz="4"/>
+          <w:insideV w:val="single" w:color="auto" w:sz="4"/>
+        </w:tblBorders>
+      </w:tblPr>
+      <w:tblGrid>
+        <w:gridCol w:w="2708"/>
+        <w:gridCol w:w="2708"/>
+        <w:gridCol w:w="3610"/>
+      </w:tblGrid>
+      <w:tr>
+        <w:trPr>
+          <w:tblHeader/>
+        </w:trPr>
+        <w:tc>
+          <w:tcPr>
+            <w:tcW w:type="dxa" w:w="2708"/>
+            <w:shd w:fill="1F4E79" w:color="auto" w:val="clear"/>
+            <w:tcMar>
+              <w:top w:type="dxa" w:w="60"/>
+              <w:left w:type="dxa" w:w="100"/>
+              <w:bottom w:type="dxa" w:w="60"/>
+              <w:right w:type="dxa" w:w="100"/>
+            </w:tcMar>
+          </w:tcPr>
+          <w:p>
+            <w:r>
+              <w:rPr>
+                <w:b/>
+                <w:bCs/>
+                <w:color w:val="FFFFFF"/>
+              </w:rPr>
+              <w:t xml:space="preserve">Grupo</w:t>
+            </w:r>
+          </w:p>
+        </w:tc>
+        <w:tc>
+          <w:tcPr>
+            <w:tcW w:type="dxa" w:w="2708"/>
+            <w:shd w:fill="1F4E79" w:color="auto" w:val="clear"/>
+            <w:tcMar>
+              <w:top w:type="dxa" w:w="60"/>
+              <w:left w:type="dxa" w:w="100"/>
+              <w:bottom w:type="dxa" w:w="60"/>
+              <w:right w:type="dxa" w:w="100"/>
+            </w:tcMar>
+          </w:tcPr>
+          <w:p>
+            <w:r>
+              <w:rPr>
+                <w:b/>
+                <w:bCs/>
+                <w:color w:val="FFFFFF"/>
+              </w:rPr>
+              <w:t xml:space="preserve">Para quê</w:t>
+            </w:r>
+          </w:p>
+        </w:tc>
+        <w:tc>
+          <w:tcPr>
+            <w:tcW w:type="dxa" w:w="3610"/>
+            <w:shd w:fill="1F4E79" w:color="auto" w:val="clear"/>
+            <w:tcMar>
+              <w:top w:type="dxa" w:w="60"/>
+              <w:left w:type="dxa" w:w="100"/>
+              <w:bottom w:type="dxa" w:w="60"/>
+              <w:right w:type="dxa" w:w="100"/>
+            </w:tcMar>
+          </w:tcPr>
+          <w:p>
+            <w:r>
+              <w:rPr>
+                <w:b/>
+                <w:bCs/>
+                <w:color w:val="FFFFFF"/>
+              </w:rPr>
+              <w:t xml:space="preserve">Comandos</w:t>
+            </w:r>
+          </w:p>
+        </w:tc>
+      </w:tr>
+      <w:tr>
+        <w:trPr>
+          <w:tblHeader w:val="off"/>
+        </w:trPr>
+        <w:tc>
+          <w:tcPr>
+            <w:tcW w:type="dxa" w:w="2708"/>
+            <w:tcMar>
+              <w:top w:type="dxa" w:w="60"/>
+              <w:left w:type="dxa" w:w="100"/>
+              <w:bottom w:type="dxa" w:w="60"/>
+              <w:right w:type="dxa" w:w="100"/>
+            </w:tcMar>
+          </w:tcPr>
+          <w:p>
+            <w:r>
+              <w:rPr>
+                <w:b/>
+                <w:bCs/>
+              </w:rPr>
+              <w:t xml:space="preserve">DDL</w:t>
+            </w:r>
+            <w:r>
+              <w:t xml:space="preserve"> — Definição</w:t>
+            </w:r>
+          </w:p>
+        </w:tc>
+        <w:tc>
+          <w:tcPr>
+            <w:tcW w:type="dxa" w:w="2708"/>
+            <w:tcMar>
+              <w:top w:type="dxa" w:w="60"/>
+              <w:left w:type="dxa" w:w="100"/>
+              <w:bottom w:type="dxa" w:w="60"/>
+              <w:right w:type="dxa" w:w="100"/>
+            </w:tcMar>
+          </w:tcPr>
+          <w:p>
+            <w:r>
+              <w:t xml:space="preserve">Mexe na </w:t>
+            </w:r>
+            <w:r>
+              <w:rPr>
+                <w:b/>
+                <w:bCs/>
+              </w:rPr>
+              <w:t xml:space="preserve">estrutura</w:t>
+            </w:r>
+          </w:p>
+        </w:tc>
+        <w:tc>
+          <w:tcPr>
+            <w:tcW w:type="dxa" w:w="3610"/>
+            <w:tcMar>
+              <w:top w:type="dxa" w:w="60"/>
+              <w:left w:type="dxa" w:w="100"/>
+              <w:bottom w:type="dxa" w:w="60"/>
+              <w:right w:type="dxa" w:w="100"/>
+            </w:tcMar>
+          </w:tcPr>
+          <w:p>
+            <w:r>
+              <w:rPr>
+                <w:rFonts w:ascii="Consolas" w:cs="Consolas" w:eastAsia="Consolas" w:hAnsi="Consolas"/>
+                <w:color w:val="A31515"/>
+              </w:rPr>
+              <w:t xml:space="preserve">CREATE</w:t>
+            </w:r>
+            <w:r>
+              <w:t xml:space="preserve">, </w:t>
+            </w:r>
+            <w:r>
+              <w:rPr>
+                <w:rFonts w:ascii="Consolas" w:cs="Consolas" w:eastAsia="Consolas" w:hAnsi="Consolas"/>
+                <w:color w:val="A31515"/>
+              </w:rPr>
+              <w:t xml:space="preserve">ALTER</w:t>
+            </w:r>
+            <w:r>
+              <w:t xml:space="preserve">, </w:t>
+            </w:r>
+            <w:r>
+              <w:rPr>
+                <w:rFonts w:ascii="Consolas" w:cs="Consolas" w:eastAsia="Consolas" w:hAnsi="Consolas"/>
+                <w:color w:val="A31515"/>
+              </w:rPr>
+              <w:t xml:space="preserve">DROP</w:t>
+            </w:r>
+          </w:p>
+        </w:tc>
+      </w:tr>
+      <w:tr>
+        <w:trPr>
+          <w:tblHeader w:val="off"/>
+        </w:trPr>
+        <w:tc>
+          <w:tcPr>
+            <w:tcW w:type="dxa" w:w="2708"/>
+            <w:tcMar>
+              <w:top w:type="dxa" w:w="60"/>
+              <w:left w:type="dxa" w:w="100"/>
+              <w:bottom w:type="dxa" w:w="60"/>
+              <w:right w:type="dxa" w:w="100"/>
+            </w:tcMar>
+          </w:tcPr>
+          <w:p>
+            <w:r>
+              <w:rPr>
+                <w:b/>
+                <w:bCs/>
+              </w:rPr>
+              <w:t xml:space="preserve">DML</w:t>
+            </w:r>
+            <w:r>
+              <w:t xml:space="preserve"> — Manipulação</w:t>
+            </w:r>
+          </w:p>
+        </w:tc>
+        <w:tc>
+          <w:tcPr>
+            <w:tcW w:type="dxa" w:w="2708"/>
+            <w:tcMar>
+              <w:top w:type="dxa" w:w="60"/>
+              <w:left w:type="dxa" w:w="100"/>
+              <w:bottom w:type="dxa" w:w="60"/>
+              <w:right w:type="dxa" w:w="100"/>
+            </w:tcMar>
+          </w:tcPr>
+          <w:p>
+            <w:r>
+              <w:t xml:space="preserve">Mexe nos </w:t>
+            </w:r>
+            <w:r>
+              <w:rPr>
+                <w:b/>
+                <w:bCs/>
+              </w:rPr>
+              <w:t xml:space="preserve">dados</w:t>
+            </w:r>
+          </w:p>
+        </w:tc>
+        <w:tc>
+          <w:tcPr>
+            <w:tcW w:type="dxa" w:w="3610"/>
+            <w:tcMar>
+              <w:top w:type="dxa" w:w="60"/>
+              <w:left w:type="dxa" w:w="100"/>
+              <w:bottom w:type="dxa" w:w="60"/>
+              <w:right w:type="dxa" w:w="100"/>
+            </w:tcMar>
+          </w:tcPr>
+          <w:p>
+            <w:r>
+              <w:rPr>
+                <w:rFonts w:ascii="Consolas" w:cs="Consolas" w:eastAsia="Consolas" w:hAnsi="Consolas"/>
+                <w:color w:val="A31515"/>
+              </w:rPr>
+              <w:t xml:space="preserve">INSERT</w:t>
+            </w:r>
+            <w:r>
+              <w:t xml:space="preserve">, </w:t>
+            </w:r>
+            <w:r>
+              <w:rPr>
+                <w:rFonts w:ascii="Consolas" w:cs="Consolas" w:eastAsia="Consolas" w:hAnsi="Consolas"/>
+                <w:color w:val="A31515"/>
+              </w:rPr>
+              <w:t xml:space="preserve">UPDATE</w:t>
+            </w:r>
+            <w:r>
+              <w:t xml:space="preserve">, </w:t>
+            </w:r>
+            <w:r>
+              <w:rPr>
+                <w:rFonts w:ascii="Consolas" w:cs="Consolas" w:eastAsia="Consolas" w:hAnsi="Consolas"/>
+                <w:color w:val="A31515"/>
+              </w:rPr>
+              <w:t xml:space="preserve">DELETE</w:t>
+            </w:r>
+            <w:r>
+              <w:t xml:space="preserve">, </w:t>
+            </w:r>
+            <w:r>
+              <w:rPr>
+                <w:rFonts w:ascii="Consolas" w:cs="Consolas" w:eastAsia="Consolas" w:hAnsi="Consolas"/>
+                <w:color w:val="A31515"/>
+              </w:rPr>
+              <w:t xml:space="preserve">SELECT</w:t>
+            </w:r>
+          </w:p>
+        </w:tc>
+      </w:tr>
+    </w:tbl>
+    <w:p>
+      <w:pPr>
+        <w:spacing w:after="120"/>
+      </w:pPr>
+    </w:p>
+    <w:p>
+      <w:pPr>
+        <w:spacing w:after="120"/>
+      </w:pPr>
+      <w:r>
+        <w:rPr>
+          <w:b/>
+          <w:bCs/>
+        </w:rPr>
+        <w:t xml:space="preserve">Texto:</w:t>
+      </w:r>
+      <w:r>
+        <w:t xml:space="preserve"> </w:t>
+      </w:r>
+      <w:r>
+        <w:rPr>
+          <w:rFonts w:ascii="Consolas" w:cs="Consolas" w:eastAsia="Consolas" w:hAnsi="Consolas"/>
+          <w:color w:val="A31515"/>
+        </w:rPr>
+        <w:t xml:space="preserve">VARCHAR(n)</w:t>
+      </w:r>
+      <w:r>
+        <w:t xml:space="preserve"> tem tamanho variável com limite; </w:t>
+      </w:r>
+      <w:r>
+        <w:rPr>
+          <w:rFonts w:ascii="Consolas" w:cs="Consolas" w:eastAsia="Consolas" w:hAnsi="Consolas"/>
+          <w:color w:val="A31515"/>
+        </w:rPr>
+        <w:t xml:space="preserve">CHAR(n)</w:t>
+      </w:r>
+      <w:r>
+        <w:t xml:space="preserve"> tem tamanho </w:t>
+      </w:r>
+      <w:r>
+        <w:rPr>
+          <w:b/>
+          <w:bCs/>
+        </w:rPr>
+        <w:t xml:space="preserve">fixo</w:t>
+      </w:r>
+      <w:r>
+        <w:t xml:space="preserve"> e completa com espaços em branco; </w:t>
+      </w:r>
+      <w:r>
+        <w:rPr>
+          <w:rFonts w:ascii="Consolas" w:cs="Consolas" w:eastAsia="Consolas" w:hAnsi="Consolas"/>
+          <w:color w:val="A31515"/>
+        </w:rPr>
+        <w:t xml:space="preserve">TEXT</w:t>
+      </w:r>
+      <w:r>
+        <w:t xml:space="preserve"> não tem limite.</w:t>
+      </w:r>
+    </w:p>
+    <w:p>
+      <w:pPr>
+        <w:spacing w:after="120"/>
+      </w:pPr>
+      <w:r>
+        <w:rPr>
+          <w:b/>
+          <w:bCs/>
+        </w:rPr>
+        <w:t xml:space="preserve">Data e hora:</w:t>
+      </w:r>
+      <w:r>
+        <w:t xml:space="preserve"> </w:t>
+      </w:r>
+      <w:r>
+        <w:rPr>
+          <w:rFonts w:ascii="Consolas" w:cs="Consolas" w:eastAsia="Consolas" w:hAnsi="Consolas"/>
+          <w:color w:val="A31515"/>
+        </w:rPr>
+        <w:t xml:space="preserve">DATE</w:t>
+      </w:r>
+      <w:r>
+        <w:t xml:space="preserve"> (só data), </w:t>
+      </w:r>
+      <w:r>
+        <w:rPr>
+          <w:rFonts w:ascii="Consolas" w:cs="Consolas" w:eastAsia="Consolas" w:hAnsi="Consolas"/>
+          <w:color w:val="A31515"/>
+        </w:rPr>
+        <w:t xml:space="preserve">TIME</w:t>
+      </w:r>
+      <w:r>
+        <w:t xml:space="preserve"> (só hora), </w:t>
+      </w:r>
+      <w:r>
+        <w:rPr>
+          <w:rFonts w:ascii="Consolas" w:cs="Consolas" w:eastAsia="Consolas" w:hAnsi="Consolas"/>
+          <w:color w:val="A31515"/>
+        </w:rPr>
+        <w:t xml:space="preserve">TIMESTAMP</w:t>
+      </w:r>
+      <w:r>
+        <w:t xml:space="preserve"> (data e hora), </w:t>
+      </w:r>
+      <w:r>
+        <w:rPr>
+          <w:rFonts w:ascii="Consolas" w:cs="Consolas" w:eastAsia="Consolas" w:hAnsi="Consolas"/>
+          <w:color w:val="A31515"/>
+        </w:rPr>
+        <w:t xml:space="preserve">INTERVAL</w:t>
+      </w:r>
+      <w:r>
+        <w:t xml:space="preserve"> (intervalo de tempo).</w:t>
+      </w:r>
+    </w:p>
+    <w:p>
+      <w:pPr>
+        <w:spacing w:after="120"/>
+      </w:pPr>
+      <w:r>
+        <w:rPr>
+          <w:b/>
+          <w:bCs/>
+        </w:rPr>
+        <w:t xml:space="preserve">Números inteiros:</w:t>
+      </w:r>
+      <w:r>
+        <w:t xml:space="preserve"> </w:t>
+      </w:r>
+      <w:r>
+        <w:rPr>
+          <w:rFonts w:ascii="Consolas" w:cs="Consolas" w:eastAsia="Consolas" w:hAnsi="Consolas"/>
+          <w:color w:val="A31515"/>
+        </w:rPr>
+        <w:t xml:space="preserve">SMALLINT</w:t>
+      </w:r>
+      <w:r>
+        <w:t xml:space="preserve"> (2 bytes), </w:t>
+      </w:r>
+      <w:r>
+        <w:rPr>
+          <w:rFonts w:ascii="Consolas" w:cs="Consolas" w:eastAsia="Consolas" w:hAnsi="Consolas"/>
+          <w:color w:val="A31515"/>
+        </w:rPr>
+        <w:t xml:space="preserve">INTEGER</w:t>
+      </w:r>
+      <w:r>
+        <w:t xml:space="preserve"> (4 bytes), </w:t>
+      </w:r>
+      <w:r>
+        <w:rPr>
+          <w:rFonts w:ascii="Consolas" w:cs="Consolas" w:eastAsia="Consolas" w:hAnsi="Consolas"/>
+          <w:color w:val="A31515"/>
+        </w:rPr>
+        <w:t xml:space="preserve">BIGINT</w:t>
+      </w:r>
+      <w:r>
+        <w:t xml:space="preserve"> (8 bytes). </w:t>
+      </w:r>
+      <w:r>
+        <w:rPr>
+          <w:rFonts w:ascii="Consolas" w:cs="Consolas" w:eastAsia="Consolas" w:hAnsi="Consolas"/>
+          <w:color w:val="A31515"/>
+        </w:rPr>
+        <w:t xml:space="preserve">SERIAL</w:t>
+      </w:r>
+      <w:r>
+        <w:t xml:space="preserve"> e </w:t>
+      </w:r>
+      <w:r>
+        <w:rPr>
+          <w:rFonts w:ascii="Consolas" w:cs="Consolas" w:eastAsia="Consolas" w:hAnsi="Consolas"/>
+          <w:color w:val="A31515"/>
+        </w:rPr>
+        <w:t xml:space="preserve">BIGSERIAL</w:t>
+      </w:r>
+      <w:r>
+        <w:t xml:space="preserve"> são inteiros numerados automaticamente.</w:t>
+      </w:r>
+    </w:p>
+    <w:p>
+      <w:pPr>
         <w:pBdr>
           <w:left w:val="single" w:color="E0A800" w:sz="24" w:space="8"/>
         </w:pBdr>
@@ -1654,20 +2183,1459 @@
           <w:left w:val="single" w:color="E0A800" w:sz="24" w:space="8"/>
         </w:pBdr>
         <w:shd w:fill="FFF4CE" w:color="auto" w:val="clear"/>
+        <w:spacing w:after="0"/>
+      </w:pPr>
+      <w:r>
+        <w:t xml:space="preserve">• </w:t>
+      </w:r>
+      <w:r>
+        <w:rPr>
+          <w:rFonts w:ascii="Consolas" w:cs="Consolas" w:eastAsia="Consolas" w:hAnsi="Consolas"/>
+          <w:color w:val="A31515"/>
+        </w:rPr>
+        <w:t xml:space="preserve">--</w:t>
+      </w:r>
+      <w:r>
+        <w:t xml:space="preserve"> começa um comentário: o banco ignora o resto da linha.</w:t>
+      </w:r>
+    </w:p>
+    <w:p>
+      <w:pPr>
+        <w:pBdr>
+          <w:left w:val="single" w:color="E0A800" w:sz="24" w:space="8"/>
+        </w:pBdr>
+        <w:shd w:fill="FFF4CE" w:color="auto" w:val="clear"/>
         <w:spacing w:after="200"/>
       </w:pPr>
       <w:r>
         <w:t xml:space="preserve">• </w:t>
       </w:r>
       <w:r>
+        <w:t xml:space="preserve">Cada comando que </w:t>
+      </w:r>
+      <w:r>
+        <w:rPr>
+          <w:b/>
+          <w:bCs/>
+        </w:rPr>
+        <w:t xml:space="preserve">altera</w:t>
+      </w:r>
+      <w:r>
+        <w:t xml:space="preserve"> o banco (</w:t>
+      </w:r>
+      <w:r>
         <w:rPr>
           <w:rFonts w:ascii="Consolas" w:cs="Consolas" w:eastAsia="Consolas" w:hAnsi="Consolas"/>
           <w:color w:val="A31515"/>
         </w:rPr>
-        <w:t xml:space="preserve">--</w:t>
-      </w:r>
-      <w:r>
-        <w:t xml:space="preserve"> começa um comentário: o banco ignora o resto da linha.</w:t>
+        <w:t xml:space="preserve">CREATE</w:t>
+      </w:r>
+      <w:r>
+        <w:t xml:space="preserve">, </w:t>
+      </w:r>
+      <w:r>
+        <w:rPr>
+          <w:rFonts w:ascii="Consolas" w:cs="Consolas" w:eastAsia="Consolas" w:hAnsi="Consolas"/>
+          <w:color w:val="A31515"/>
+        </w:rPr>
+        <w:t xml:space="preserve">ALTER</w:t>
+      </w:r>
+      <w:r>
+        <w:t xml:space="preserve">, </w:t>
+      </w:r>
+      <w:r>
+        <w:rPr>
+          <w:rFonts w:ascii="Consolas" w:cs="Consolas" w:eastAsia="Consolas" w:hAnsi="Consolas"/>
+          <w:color w:val="A31515"/>
+        </w:rPr>
+        <w:t xml:space="preserve">INSERT</w:t>
+      </w:r>
+      <w:r>
+        <w:t xml:space="preserve">, </w:t>
+      </w:r>
+      <w:r>
+        <w:rPr>
+          <w:rFonts w:ascii="Consolas" w:cs="Consolas" w:eastAsia="Consolas" w:hAnsi="Consolas"/>
+          <w:color w:val="A31515"/>
+        </w:rPr>
+        <w:t xml:space="preserve">DROP</w:t>
+      </w:r>
+      <w:r>
+        <w:t xml:space="preserve">) roda </w:t>
+      </w:r>
+      <w:r>
+        <w:rPr>
+          <w:b/>
+          <w:bCs/>
+        </w:rPr>
+        <w:t xml:space="preserve">uma vez só</w:t>
+      </w:r>
+      <w:r>
+        <w:t xml:space="preserve">. Repetir dá erro ou duplica dados. </w:t>
+      </w:r>
+      <w:r>
+        <w:rPr>
+          <w:rFonts w:ascii="Consolas" w:cs="Consolas" w:eastAsia="Consolas" w:hAnsi="Consolas"/>
+          <w:color w:val="A31515"/>
+        </w:rPr>
+        <w:t xml:space="preserve">SELECT</w:t>
+      </w:r>
+      <w:r>
+        <w:t xml:space="preserve"> pode repetir à vontade.</w:t>
+      </w:r>
+    </w:p>
+    <w:p>
+      <w:pPr>
+        <w:pStyle w:val="Heading1"/>
+        <w:pageBreakBefore/>
+      </w:pPr>
+      <w:r>
+        <w:t xml:space="preserve">Aula 02 — WHERE, ORDER BY, UPDATE e DELETE</w:t>
+      </w:r>
+    </w:p>
+    <w:p>
+      <w:pPr>
+        <w:pStyle w:val="Heading2"/>
+      </w:pPr>
+      <w:r>
+        <w:t xml:space="preserve">1. WHERE — filtrar linhas</w:t>
+      </w:r>
+    </w:p>
+    <w:p>
+      <w:pPr>
+        <w:spacing w:after="120"/>
+      </w:pPr>
+      <w:r>
+        <w:t xml:space="preserve">O </w:t>
+      </w:r>
+      <w:r>
+        <w:rPr>
+          <w:rFonts w:ascii="Consolas" w:cs="Consolas" w:eastAsia="Consolas" w:hAnsi="Consolas"/>
+          <w:color w:val="A31515"/>
+        </w:rPr>
+        <w:t xml:space="preserve">WHERE</w:t>
+      </w:r>
+      <w:r>
+        <w:t xml:space="preserve"> diz </w:t>
+      </w:r>
+      <w:r>
+        <w:rPr>
+          <w:b/>
+          <w:bCs/>
+        </w:rPr>
+        <w:t xml:space="preserve">quais linhas</w:t>
+      </w:r>
+      <w:r>
+        <w:t xml:space="preserve"> entram no resultado. Só aparecem as linhas em que a condição é verdadeira.</w:t>
+      </w:r>
+    </w:p>
+    <w:p>
+      <w:pPr>
+        <w:pBdr>
+          <w:top w:val="single" w:color="BFBFBF" w:sz="4" w:space="4"/>
+        </w:pBdr>
+        <w:shd w:fill="F2F2F2" w:color="auto" w:val="clear"/>
+        <w:spacing w:after="0"/>
+        <w:ind w:left="200" w:right="200"/>
+      </w:pPr>
+      <w:r>
+        <w:rPr>
+          <w:rFonts w:ascii="Consolas" w:cs="Consolas" w:eastAsia="Consolas" w:hAnsi="Consolas"/>
+          <w:sz w:val="19"/>
+          <w:szCs w:val="19"/>
+        </w:rPr>
+        <w:t xml:space="preserve">SELECT nome, escolaridade</w:t>
+      </w:r>
+    </w:p>
+    <w:p>
+      <w:pPr>
+        <w:shd w:fill="F2F2F2" w:color="auto" w:val="clear"/>
+        <w:spacing w:after="0"/>
+        <w:ind w:left="200" w:right="200"/>
+      </w:pPr>
+      <w:r>
+        <w:rPr>
+          <w:rFonts w:ascii="Consolas" w:cs="Consolas" w:eastAsia="Consolas" w:hAnsi="Consolas"/>
+          <w:sz w:val="19"/>
+          <w:szCs w:val="19"/>
+        </w:rPr>
+        <w:t xml:space="preserve">FROM funcionario</w:t>
+      </w:r>
+    </w:p>
+    <w:p>
+      <w:pPr>
+        <w:pBdr>
+          <w:bottom w:val="single" w:color="BFBFBF" w:sz="4" w:space="4"/>
+        </w:pBdr>
+        <w:shd w:fill="F2F2F2" w:color="auto" w:val="clear"/>
+        <w:spacing w:after="160"/>
+        <w:ind w:left="200" w:right="200"/>
+      </w:pPr>
+      <w:r>
+        <w:rPr>
+          <w:rFonts w:ascii="Consolas" w:cs="Consolas" w:eastAsia="Consolas" w:hAnsi="Consolas"/>
+          <w:sz w:val="19"/>
+          <w:szCs w:val="19"/>
+        </w:rPr>
+        <w:t xml:space="preserve">WHERE escolaridade = 'MESTRE';</w:t>
+      </w:r>
+    </w:p>
+    <w:tbl>
+      <w:tblPr>
+        <w:tblW w:type="dxa" w:w="9026"/>
+        <w:tblBorders>
+          <w:top w:val="single" w:color="auto" w:sz="4"/>
+          <w:left w:val="single" w:color="auto" w:sz="4"/>
+          <w:bottom w:val="single" w:color="auto" w:sz="4"/>
+          <w:right w:val="single" w:color="auto" w:sz="4"/>
+          <w:insideH w:val="single" w:color="auto" w:sz="4"/>
+          <w:insideV w:val="single" w:color="auto" w:sz="4"/>
+        </w:tblBorders>
+      </w:tblPr>
+      <w:tblGrid>
+        <w:gridCol w:w="1986"/>
+        <w:gridCol w:w="3881"/>
+        <w:gridCol w:w="3159"/>
+      </w:tblGrid>
+      <w:tr>
+        <w:trPr>
+          <w:tblHeader/>
+        </w:trPr>
+        <w:tc>
+          <w:tcPr>
+            <w:tcW w:type="dxa" w:w="1986"/>
+            <w:shd w:fill="1F4E79" w:color="auto" w:val="clear"/>
+            <w:tcMar>
+              <w:top w:type="dxa" w:w="60"/>
+              <w:left w:type="dxa" w:w="100"/>
+              <w:bottom w:type="dxa" w:w="60"/>
+              <w:right w:type="dxa" w:w="100"/>
+            </w:tcMar>
+          </w:tcPr>
+          <w:p>
+            <w:r>
+              <w:rPr>
+                <w:b/>
+                <w:bCs/>
+                <w:color w:val="FFFFFF"/>
+              </w:rPr>
+              <w:t xml:space="preserve">Operador</w:t>
+            </w:r>
+          </w:p>
+        </w:tc>
+        <w:tc>
+          <w:tcPr>
+            <w:tcW w:type="dxa" w:w="3881"/>
+            <w:shd w:fill="1F4E79" w:color="auto" w:val="clear"/>
+            <w:tcMar>
+              <w:top w:type="dxa" w:w="60"/>
+              <w:left w:type="dxa" w:w="100"/>
+              <w:bottom w:type="dxa" w:w="60"/>
+              <w:right w:type="dxa" w:w="100"/>
+            </w:tcMar>
+          </w:tcPr>
+          <w:p>
+            <w:r>
+              <w:rPr>
+                <w:b/>
+                <w:bCs/>
+                <w:color w:val="FFFFFF"/>
+              </w:rPr>
+              <w:t xml:space="preserve">Significa</w:t>
+            </w:r>
+          </w:p>
+        </w:tc>
+        <w:tc>
+          <w:tcPr>
+            <w:tcW w:type="dxa" w:w="3159"/>
+            <w:shd w:fill="1F4E79" w:color="auto" w:val="clear"/>
+            <w:tcMar>
+              <w:top w:type="dxa" w:w="60"/>
+              <w:left w:type="dxa" w:w="100"/>
+              <w:bottom w:type="dxa" w:w="60"/>
+              <w:right w:type="dxa" w:w="100"/>
+            </w:tcMar>
+          </w:tcPr>
+          <w:p>
+            <w:r>
+              <w:rPr>
+                <w:b/>
+                <w:bCs/>
+                <w:color w:val="FFFFFF"/>
+              </w:rPr>
+              <w:t xml:space="preserve">Exemplo</w:t>
+            </w:r>
+          </w:p>
+        </w:tc>
+      </w:tr>
+      <w:tr>
+        <w:trPr>
+          <w:tblHeader w:val="off"/>
+        </w:trPr>
+        <w:tc>
+          <w:tcPr>
+            <w:tcW w:type="dxa" w:w="1986"/>
+            <w:tcMar>
+              <w:top w:type="dxa" w:w="60"/>
+              <w:left w:type="dxa" w:w="100"/>
+              <w:bottom w:type="dxa" w:w="60"/>
+              <w:right w:type="dxa" w:w="100"/>
+            </w:tcMar>
+          </w:tcPr>
+          <w:p>
+            <w:r>
+              <w:rPr>
+                <w:rFonts w:ascii="Consolas" w:cs="Consolas" w:eastAsia="Consolas" w:hAnsi="Consolas"/>
+                <w:color w:val="A31515"/>
+              </w:rPr>
+              <w:t xml:space="preserve">=</w:t>
+            </w:r>
+          </w:p>
+        </w:tc>
+        <w:tc>
+          <w:tcPr>
+            <w:tcW w:type="dxa" w:w="3881"/>
+            <w:tcMar>
+              <w:top w:type="dxa" w:w="60"/>
+              <w:left w:type="dxa" w:w="100"/>
+              <w:bottom w:type="dxa" w:w="60"/>
+              <w:right w:type="dxa" w:w="100"/>
+            </w:tcMar>
+          </w:tcPr>
+          <w:p>
+            <w:r>
+              <w:t xml:space="preserve">igual</w:t>
+            </w:r>
+          </w:p>
+        </w:tc>
+        <w:tc>
+          <w:tcPr>
+            <w:tcW w:type="dxa" w:w="3159"/>
+            <w:tcMar>
+              <w:top w:type="dxa" w:w="60"/>
+              <w:left w:type="dxa" w:w="100"/>
+              <w:bottom w:type="dxa" w:w="60"/>
+              <w:right w:type="dxa" w:w="100"/>
+            </w:tcMar>
+          </w:tcPr>
+          <w:p>
+            <w:r>
+              <w:rPr>
+                <w:rFonts w:ascii="Consolas" w:cs="Consolas" w:eastAsia="Consolas" w:hAnsi="Consolas"/>
+                <w:color w:val="A31515"/>
+              </w:rPr>
+              <w:t xml:space="preserve">escolaridade = 'DOUTOR'</w:t>
+            </w:r>
+          </w:p>
+        </w:tc>
+      </w:tr>
+      <w:tr>
+        <w:trPr>
+          <w:tblHeader w:val="off"/>
+        </w:trPr>
+        <w:tc>
+          <w:tcPr>
+            <w:tcW w:type="dxa" w:w="1986"/>
+            <w:tcMar>
+              <w:top w:type="dxa" w:w="60"/>
+              <w:left w:type="dxa" w:w="100"/>
+              <w:bottom w:type="dxa" w:w="60"/>
+              <w:right w:type="dxa" w:w="100"/>
+            </w:tcMar>
+          </w:tcPr>
+          <w:p>
+            <w:r>
+              <w:rPr>
+                <w:rFonts w:ascii="Consolas" w:cs="Consolas" w:eastAsia="Consolas" w:hAnsi="Consolas"/>
+                <w:color w:val="A31515"/>
+              </w:rPr>
+              <w:t xml:space="preserve">&lt;&gt;</w:t>
+            </w:r>
+            <w:r>
+              <w:t xml:space="preserve"> ou </w:t>
+            </w:r>
+            <w:r>
+              <w:rPr>
+                <w:rFonts w:ascii="Consolas" w:cs="Consolas" w:eastAsia="Consolas" w:hAnsi="Consolas"/>
+                <w:color w:val="A31515"/>
+              </w:rPr>
+              <w:t xml:space="preserve">!=</w:t>
+            </w:r>
+          </w:p>
+        </w:tc>
+        <w:tc>
+          <w:tcPr>
+            <w:tcW w:type="dxa" w:w="3881"/>
+            <w:tcMar>
+              <w:top w:type="dxa" w:w="60"/>
+              <w:left w:type="dxa" w:w="100"/>
+              <w:bottom w:type="dxa" w:w="60"/>
+              <w:right w:type="dxa" w:w="100"/>
+            </w:tcMar>
+          </w:tcPr>
+          <w:p>
+            <w:r>
+              <w:t xml:space="preserve">diferente</w:t>
+            </w:r>
+          </w:p>
+        </w:tc>
+        <w:tc>
+          <w:tcPr>
+            <w:tcW w:type="dxa" w:w="3159"/>
+            <w:tcMar>
+              <w:top w:type="dxa" w:w="60"/>
+              <w:left w:type="dxa" w:w="100"/>
+              <w:bottom w:type="dxa" w:w="60"/>
+              <w:right w:type="dxa" w:w="100"/>
+            </w:tcMar>
+          </w:tcPr>
+          <w:p>
+            <w:r>
+              <w:rPr>
+                <w:rFonts w:ascii="Consolas" w:cs="Consolas" w:eastAsia="Consolas" w:hAnsi="Consolas"/>
+                <w:color w:val="A31515"/>
+              </w:rPr>
+              <w:t xml:space="preserve">descricao &lt;&gt; 'PROGRAMADOR'</w:t>
+            </w:r>
+          </w:p>
+        </w:tc>
+      </w:tr>
+      <w:tr>
+        <w:trPr>
+          <w:tblHeader w:val="off"/>
+        </w:trPr>
+        <w:tc>
+          <w:tcPr>
+            <w:tcW w:type="dxa" w:w="1986"/>
+            <w:tcMar>
+              <w:top w:type="dxa" w:w="60"/>
+              <w:left w:type="dxa" w:w="100"/>
+              <w:bottom w:type="dxa" w:w="60"/>
+              <w:right w:type="dxa" w:w="100"/>
+            </w:tcMar>
+          </w:tcPr>
+          <w:p>
+            <w:r>
+              <w:rPr>
+                <w:rFonts w:ascii="Consolas" w:cs="Consolas" w:eastAsia="Consolas" w:hAnsi="Consolas"/>
+                <w:color w:val="A31515"/>
+              </w:rPr>
+              <w:t xml:space="preserve">&gt;</w:t>
+            </w:r>
+            <w:r>
+              <w:t xml:space="preserve"> </w:t>
+            </w:r>
+            <w:r>
+              <w:rPr>
+                <w:rFonts w:ascii="Consolas" w:cs="Consolas" w:eastAsia="Consolas" w:hAnsi="Consolas"/>
+                <w:color w:val="A31515"/>
+              </w:rPr>
+              <w:t xml:space="preserve">&lt;</w:t>
+            </w:r>
+            <w:r>
+              <w:t xml:space="preserve"> </w:t>
+            </w:r>
+            <w:r>
+              <w:rPr>
+                <w:rFonts w:ascii="Consolas" w:cs="Consolas" w:eastAsia="Consolas" w:hAnsi="Consolas"/>
+                <w:color w:val="A31515"/>
+              </w:rPr>
+              <w:t xml:space="preserve">&gt;=</w:t>
+            </w:r>
+            <w:r>
+              <w:t xml:space="preserve"> </w:t>
+            </w:r>
+            <w:r>
+              <w:rPr>
+                <w:rFonts w:ascii="Consolas" w:cs="Consolas" w:eastAsia="Consolas" w:hAnsi="Consolas"/>
+                <w:color w:val="A31515"/>
+              </w:rPr>
+              <w:t xml:space="preserve">&lt;=</w:t>
+            </w:r>
+          </w:p>
+        </w:tc>
+        <w:tc>
+          <w:tcPr>
+            <w:tcW w:type="dxa" w:w="3881"/>
+            <w:tcMar>
+              <w:top w:type="dxa" w:w="60"/>
+              <w:left w:type="dxa" w:w="100"/>
+              <w:bottom w:type="dxa" w:w="60"/>
+              <w:right w:type="dxa" w:w="100"/>
+            </w:tcMar>
+          </w:tcPr>
+          <w:p>
+            <w:r>
+              <w:t xml:space="preserve">maior, menor, maior ou igual, menor ou igual</w:t>
+            </w:r>
+          </w:p>
+        </w:tc>
+        <w:tc>
+          <w:tcPr>
+            <w:tcW w:type="dxa" w:w="3159"/>
+            <w:tcMar>
+              <w:top w:type="dxa" w:w="60"/>
+              <w:left w:type="dxa" w:w="100"/>
+              <w:bottom w:type="dxa" w:w="60"/>
+              <w:right w:type="dxa" w:w="100"/>
+            </w:tcMar>
+          </w:tcPr>
+          <w:p>
+            <w:r>
+              <w:rPr>
+                <w:rFonts w:ascii="Consolas" w:cs="Consolas" w:eastAsia="Consolas" w:hAnsi="Consolas"/>
+                <w:color w:val="A31515"/>
+              </w:rPr>
+              <w:t xml:space="preserve">valor &gt; 2000</w:t>
+            </w:r>
+          </w:p>
+        </w:tc>
+      </w:tr>
+      <w:tr>
+        <w:trPr>
+          <w:tblHeader w:val="off"/>
+        </w:trPr>
+        <w:tc>
+          <w:tcPr>
+            <w:tcW w:type="dxa" w:w="1986"/>
+            <w:tcMar>
+              <w:top w:type="dxa" w:w="60"/>
+              <w:left w:type="dxa" w:w="100"/>
+              <w:bottom w:type="dxa" w:w="60"/>
+              <w:right w:type="dxa" w:w="100"/>
+            </w:tcMar>
+          </w:tcPr>
+          <w:p>
+            <w:r>
+              <w:rPr>
+                <w:rFonts w:ascii="Consolas" w:cs="Consolas" w:eastAsia="Consolas" w:hAnsi="Consolas"/>
+                <w:color w:val="A31515"/>
+              </w:rPr>
+              <w:t xml:space="preserve">AND</w:t>
+            </w:r>
+          </w:p>
+        </w:tc>
+        <w:tc>
+          <w:tcPr>
+            <w:tcW w:type="dxa" w:w="3881"/>
+            <w:tcMar>
+              <w:top w:type="dxa" w:w="60"/>
+              <w:left w:type="dxa" w:w="100"/>
+              <w:bottom w:type="dxa" w:w="60"/>
+              <w:right w:type="dxa" w:w="100"/>
+            </w:tcMar>
+          </w:tcPr>
+          <w:p>
+            <w:r>
+              <w:t xml:space="preserve">as </w:t>
+            </w:r>
+            <w:r>
+              <w:rPr>
+                <w:b/>
+                <w:bCs/>
+              </w:rPr>
+              <w:t xml:space="preserve">duas</w:t>
+            </w:r>
+            <w:r>
+              <w:t xml:space="preserve"> condições precisam ser verdadeiras</w:t>
+            </w:r>
+          </w:p>
+        </w:tc>
+        <w:tc>
+          <w:tcPr>
+            <w:tcW w:type="dxa" w:w="3159"/>
+            <w:tcMar>
+              <w:top w:type="dxa" w:w="60"/>
+              <w:left w:type="dxa" w:w="100"/>
+              <w:bottom w:type="dxa" w:w="60"/>
+              <w:right w:type="dxa" w:w="100"/>
+            </w:tcMar>
+          </w:tcPr>
+          <w:p>
+            <w:r>
+              <w:rPr>
+                <w:rFonts w:ascii="Consolas" w:cs="Consolas" w:eastAsia="Consolas" w:hAnsi="Consolas"/>
+                <w:color w:val="A31515"/>
+              </w:rPr>
+              <w:t xml:space="preserve">valor &gt; 1000 AND valor &lt; 3000</w:t>
+            </w:r>
+          </w:p>
+        </w:tc>
+      </w:tr>
+      <w:tr>
+        <w:trPr>
+          <w:tblHeader w:val="off"/>
+        </w:trPr>
+        <w:tc>
+          <w:tcPr>
+            <w:tcW w:type="dxa" w:w="1986"/>
+            <w:tcMar>
+              <w:top w:type="dxa" w:w="60"/>
+              <w:left w:type="dxa" w:w="100"/>
+              <w:bottom w:type="dxa" w:w="60"/>
+              <w:right w:type="dxa" w:w="100"/>
+            </w:tcMar>
+          </w:tcPr>
+          <w:p>
+            <w:r>
+              <w:rPr>
+                <w:rFonts w:ascii="Consolas" w:cs="Consolas" w:eastAsia="Consolas" w:hAnsi="Consolas"/>
+                <w:color w:val="A31515"/>
+              </w:rPr>
+              <w:t xml:space="preserve">OR</w:t>
+            </w:r>
+          </w:p>
+        </w:tc>
+        <w:tc>
+          <w:tcPr>
+            <w:tcW w:type="dxa" w:w="3881"/>
+            <w:tcMar>
+              <w:top w:type="dxa" w:w="60"/>
+              <w:left w:type="dxa" w:w="100"/>
+              <w:bottom w:type="dxa" w:w="60"/>
+              <w:right w:type="dxa" w:w="100"/>
+            </w:tcMar>
+          </w:tcPr>
+          <w:p>
+            <w:r>
+              <w:t xml:space="preserve">basta </w:t>
+            </w:r>
+            <w:r>
+              <w:rPr>
+                <w:b/>
+                <w:bCs/>
+              </w:rPr>
+              <w:t xml:space="preserve">uma</w:t>
+            </w:r>
+            <w:r>
+              <w:t xml:space="preserve"> ser verdadeira</w:t>
+            </w:r>
+          </w:p>
+        </w:tc>
+        <w:tc>
+          <w:tcPr>
+            <w:tcW w:type="dxa" w:w="3159"/>
+            <w:tcMar>
+              <w:top w:type="dxa" w:w="60"/>
+              <w:left w:type="dxa" w:w="100"/>
+              <w:bottom w:type="dxa" w:w="60"/>
+              <w:right w:type="dxa" w:w="100"/>
+            </w:tcMar>
+          </w:tcPr>
+          <w:p>
+            <w:r>
+              <w:rPr>
+                <w:rFonts w:ascii="Consolas" w:cs="Consolas" w:eastAsia="Consolas" w:hAnsi="Consolas"/>
+                <w:color w:val="A31515"/>
+              </w:rPr>
+              <w:t xml:space="preserve">ano = 2004 OR ano = 2005</w:t>
+            </w:r>
+          </w:p>
+        </w:tc>
+      </w:tr>
+      <w:tr>
+        <w:trPr>
+          <w:tblHeader w:val="off"/>
+        </w:trPr>
+        <w:tc>
+          <w:tcPr>
+            <w:tcW w:type="dxa" w:w="1986"/>
+            <w:tcMar>
+              <w:top w:type="dxa" w:w="60"/>
+              <w:left w:type="dxa" w:w="100"/>
+              <w:bottom w:type="dxa" w:w="60"/>
+              <w:right w:type="dxa" w:w="100"/>
+            </w:tcMar>
+          </w:tcPr>
+          <w:p>
+            <w:r>
+              <w:rPr>
+                <w:rFonts w:ascii="Consolas" w:cs="Consolas" w:eastAsia="Consolas" w:hAnsi="Consolas"/>
+                <w:color w:val="A31515"/>
+              </w:rPr>
+              <w:t xml:space="preserve">IN (...)</w:t>
+            </w:r>
+          </w:p>
+        </w:tc>
+        <w:tc>
+          <w:tcPr>
+            <w:tcW w:type="dxa" w:w="3881"/>
+            <w:tcMar>
+              <w:top w:type="dxa" w:w="60"/>
+              <w:left w:type="dxa" w:w="100"/>
+              <w:bottom w:type="dxa" w:w="60"/>
+              <w:right w:type="dxa" w:w="100"/>
+            </w:tcMar>
+          </w:tcPr>
+          <w:p>
+            <w:r>
+              <w:t xml:space="preserve">igual a qualquer item da lista (atalho para vários OR)</w:t>
+            </w:r>
+          </w:p>
+        </w:tc>
+        <w:tc>
+          <w:tcPr>
+            <w:tcW w:type="dxa" w:w="3159"/>
+            <w:tcMar>
+              <w:top w:type="dxa" w:w="60"/>
+              <w:left w:type="dxa" w:w="100"/>
+              <w:bottom w:type="dxa" w:w="60"/>
+              <w:right w:type="dxa" w:w="100"/>
+            </w:tcMar>
+          </w:tcPr>
+          <w:p>
+            <w:r>
+              <w:rPr>
+                <w:rFonts w:ascii="Consolas" w:cs="Consolas" w:eastAsia="Consolas" w:hAnsi="Consolas"/>
+                <w:color w:val="A31515"/>
+              </w:rPr>
+              <w:t xml:space="preserve">escolaridade IN ('MESTRE', 'DOUTOR')</w:t>
+            </w:r>
+          </w:p>
+        </w:tc>
+      </w:tr>
+      <w:tr>
+        <w:trPr>
+          <w:tblHeader w:val="off"/>
+        </w:trPr>
+        <w:tc>
+          <w:tcPr>
+            <w:tcW w:type="dxa" w:w="1986"/>
+            <w:tcMar>
+              <w:top w:type="dxa" w:w="60"/>
+              <w:left w:type="dxa" w:w="100"/>
+              <w:bottom w:type="dxa" w:w="60"/>
+              <w:right w:type="dxa" w:w="100"/>
+            </w:tcMar>
+          </w:tcPr>
+          <w:p>
+            <w:r>
+              <w:rPr>
+                <w:rFonts w:ascii="Consolas" w:cs="Consolas" w:eastAsia="Consolas" w:hAnsi="Consolas"/>
+                <w:color w:val="A31515"/>
+              </w:rPr>
+              <w:t xml:space="preserve">IS NULL</w:t>
+            </w:r>
+          </w:p>
+        </w:tc>
+        <w:tc>
+          <w:tcPr>
+            <w:tcW w:type="dxa" w:w="3881"/>
+            <w:tcMar>
+              <w:top w:type="dxa" w:w="60"/>
+              <w:left w:type="dxa" w:w="100"/>
+              <w:bottom w:type="dxa" w:w="60"/>
+              <w:right w:type="dxa" w:w="100"/>
+            </w:tcMar>
+          </w:tcPr>
+          <w:p>
+            <w:r>
+              <w:t xml:space="preserve">está vazio (</w:t>
+            </w:r>
+            <w:r>
+              <w:rPr>
+                <w:b/>
+                <w:bCs/>
+              </w:rPr>
+              <w:t xml:space="preserve">nunca</w:t>
+            </w:r>
+            <w:r>
+              <w:t xml:space="preserve"> use </w:t>
+            </w:r>
+            <w:r>
+              <w:rPr>
+                <w:rFonts w:ascii="Consolas" w:cs="Consolas" w:eastAsia="Consolas" w:hAnsi="Consolas"/>
+                <w:color w:val="A31515"/>
+              </w:rPr>
+              <w:t xml:space="preserve">= NULL</w:t>
+            </w:r>
+            <w:r>
+              <w:t xml:space="preserve">)</w:t>
+            </w:r>
+          </w:p>
+        </w:tc>
+        <w:tc>
+          <w:tcPr>
+            <w:tcW w:type="dxa" w:w="3159"/>
+            <w:tcMar>
+              <w:top w:type="dxa" w:w="60"/>
+              <w:left w:type="dxa" w:w="100"/>
+              <w:bottom w:type="dxa" w:w="60"/>
+              <w:right w:type="dxa" w:w="100"/>
+            </w:tcMar>
+          </w:tcPr>
+          <w:p>
+            <w:r>
+              <w:rPr>
+                <w:rFonts w:ascii="Consolas" w:cs="Consolas" w:eastAsia="Consolas" w:hAnsi="Consolas"/>
+                <w:color w:val="A31515"/>
+              </w:rPr>
+              <w:t xml:space="preserve">email IS NULL</w:t>
+            </w:r>
+          </w:p>
+        </w:tc>
+      </w:tr>
+    </w:tbl>
+    <w:p>
+      <w:pPr>
+        <w:spacing w:after="120"/>
+      </w:pPr>
+    </w:p>
+    <w:p>
+      <w:pPr>
+        <w:pStyle w:val="Heading2"/>
+      </w:pPr>
+      <w:r>
+        <w:t xml:space="preserve">2. ORDER BY — ordenar</w:t>
+      </w:r>
+    </w:p>
+    <w:p>
+      <w:pPr>
+        <w:pBdr>
+          <w:top w:val="single" w:color="BFBFBF" w:sz="4" w:space="4"/>
+        </w:pBdr>
+        <w:shd w:fill="F2F2F2" w:color="auto" w:val="clear"/>
+        <w:spacing w:after="0"/>
+        <w:ind w:left="200" w:right="200"/>
+      </w:pPr>
+      <w:r>
+        <w:rPr>
+          <w:rFonts w:ascii="Consolas" w:cs="Consolas" w:eastAsia="Consolas" w:hAnsi="Consolas"/>
+          <w:sz w:val="19"/>
+          <w:szCs w:val="19"/>
+        </w:rPr>
+        <w:t xml:space="preserve">SELECT descricao, valor</w:t>
+      </w:r>
+    </w:p>
+    <w:p>
+      <w:pPr>
+        <w:shd w:fill="F2F2F2" w:color="auto" w:val="clear"/>
+        <w:spacing w:after="0"/>
+        <w:ind w:left="200" w:right="200"/>
+      </w:pPr>
+      <w:r>
+        <w:rPr>
+          <w:rFonts w:ascii="Consolas" w:cs="Consolas" w:eastAsia="Consolas" w:hAnsi="Consolas"/>
+          <w:sz w:val="19"/>
+          <w:szCs w:val="19"/>
+        </w:rPr>
+        <w:t xml:space="preserve">FROM cargo</w:t>
+      </w:r>
+    </w:p>
+    <w:p>
+      <w:pPr>
+        <w:shd w:fill="F2F2F2" w:color="auto" w:val="clear"/>
+        <w:spacing w:after="0"/>
+        <w:ind w:left="200" w:right="200"/>
+      </w:pPr>
+      <w:r>
+        <w:rPr>
+          <w:rFonts w:ascii="Consolas" w:cs="Consolas" w:eastAsia="Consolas" w:hAnsi="Consolas"/>
+          <w:sz w:val="19"/>
+          <w:szCs w:val="19"/>
+        </w:rPr>
+        <w:t xml:space="preserve">ORDER BY valor DESC;           -- DESC = decrescente (maior -&gt; menor)</w:t>
+      </w:r>
+    </w:p>
+    <w:p>
+      <w:pPr>
+        <w:shd w:fill="F2F2F2" w:color="auto" w:val="clear"/>
+        <w:spacing w:after="0"/>
+        <w:ind w:left="200" w:right="200"/>
+      </w:pPr>
+      <w:r>
+        <w:rPr>
+          <w:rFonts w:ascii="Consolas" w:cs="Consolas" w:eastAsia="Consolas" w:hAnsi="Consolas"/>
+          <w:sz w:val="19"/>
+          <w:szCs w:val="19"/>
+        </w:rPr>
+        <w:t xml:space="preserve"> </w:t>
+      </w:r>
+    </w:p>
+    <w:p>
+      <w:pPr>
+        <w:shd w:fill="F2F2F2" w:color="auto" w:val="clear"/>
+        <w:spacing w:after="0"/>
+        <w:ind w:left="200" w:right="200"/>
+      </w:pPr>
+      <w:r>
+        <w:rPr>
+          <w:rFonts w:ascii="Consolas" w:cs="Consolas" w:eastAsia="Consolas" w:hAnsi="Consolas"/>
+          <w:sz w:val="19"/>
+          <w:szCs w:val="19"/>
+        </w:rPr>
+        <w:t xml:space="preserve">SELECT nome, escolaridade</w:t>
+      </w:r>
+    </w:p>
+    <w:p>
+      <w:pPr>
+        <w:shd w:fill="F2F2F2" w:color="auto" w:val="clear"/>
+        <w:spacing w:after="0"/>
+        <w:ind w:left="200" w:right="200"/>
+      </w:pPr>
+      <w:r>
+        <w:rPr>
+          <w:rFonts w:ascii="Consolas" w:cs="Consolas" w:eastAsia="Consolas" w:hAnsi="Consolas"/>
+          <w:sz w:val="19"/>
+          <w:szCs w:val="19"/>
+        </w:rPr>
+        <w:t xml:space="preserve">FROM funcionario</w:t>
+      </w:r>
+    </w:p>
+    <w:p>
+      <w:pPr>
+        <w:pBdr>
+          <w:bottom w:val="single" w:color="BFBFBF" w:sz="4" w:space="4"/>
+        </w:pBdr>
+        <w:shd w:fill="F2F2F2" w:color="auto" w:val="clear"/>
+        <w:spacing w:after="160"/>
+        <w:ind w:left="200" w:right="200"/>
+      </w:pPr>
+      <w:r>
+        <w:rPr>
+          <w:rFonts w:ascii="Consolas" w:cs="Consolas" w:eastAsia="Consolas" w:hAnsi="Consolas"/>
+          <w:sz w:val="19"/>
+          <w:szCs w:val="19"/>
+        </w:rPr>
+        <w:t xml:space="preserve">ORDER BY escolaridade, nome;   -- desempate: escolaridade, depois nome</w:t>
+      </w:r>
+    </w:p>
+    <w:p>
+      <w:pPr>
+        <w:pStyle w:val="ListParagraph"/>
+        <w:numPr>
+          <w:ilvl w:val="0"/>
+          <w:numId w:val="2"/>
+        </w:numPr>
+        <w:spacing w:after="60"/>
+      </w:pPr>
+      <w:r>
+        <w:rPr>
+          <w:rFonts w:ascii="Consolas" w:cs="Consolas" w:eastAsia="Consolas" w:hAnsi="Consolas"/>
+          <w:color w:val="A31515"/>
+        </w:rPr>
+        <w:t xml:space="preserve">ASC</w:t>
+      </w:r>
+      <w:r>
+        <w:t xml:space="preserve"> = crescente (A→Z, menor→maior). É o </w:t>
+      </w:r>
+      <w:r>
+        <w:rPr>
+          <w:b/>
+          <w:bCs/>
+        </w:rPr>
+        <w:t xml:space="preserve">padrão</w:t>
+      </w:r>
+      <w:r>
+        <w:t xml:space="preserve">: se não escrever nada, é ASC.</w:t>
+      </w:r>
+    </w:p>
+    <w:p>
+      <w:pPr>
+        <w:pStyle w:val="ListParagraph"/>
+        <w:numPr>
+          <w:ilvl w:val="0"/>
+          <w:numId w:val="2"/>
+        </w:numPr>
+        <w:spacing w:after="60"/>
+      </w:pPr>
+      <w:r>
+        <w:rPr>
+          <w:rFonts w:ascii="Consolas" w:cs="Consolas" w:eastAsia="Consolas" w:hAnsi="Consolas"/>
+          <w:color w:val="A31515"/>
+        </w:rPr>
+        <w:t xml:space="preserve">DESC</w:t>
+      </w:r>
+      <w:r>
+        <w:t xml:space="preserve"> = decrescente (Z→A, maior→menor).</w:t>
+      </w:r>
+    </w:p>
+    <w:p>
+      <w:pPr>
+        <w:pStyle w:val="ListParagraph"/>
+        <w:numPr>
+          <w:ilvl w:val="0"/>
+          <w:numId w:val="2"/>
+        </w:numPr>
+        <w:spacing w:after="60"/>
+      </w:pPr>
+      <w:r>
+        <w:t xml:space="preserve">Com várias colunas, a segunda só serve para </w:t>
+      </w:r>
+      <w:r>
+        <w:rPr>
+          <w:b/>
+          <w:bCs/>
+        </w:rPr>
+        <w:t xml:space="preserve">desempatar</w:t>
+      </w:r>
+      <w:r>
+        <w:t xml:space="preserve"> a primeira.</w:t>
+      </w:r>
+    </w:p>
+    <w:p>
+      <w:pPr>
+        <w:spacing w:after="120"/>
+      </w:pPr>
+      <w:r>
+        <w:rPr>
+          <w:b/>
+          <w:bCs/>
+        </w:rPr>
+        <w:t xml:space="preserve">Ordem obrigatória das cláusulas:</w:t>
+      </w:r>
+      <w:r>
+        <w:t xml:space="preserve"> </w:t>
+      </w:r>
+      <w:r>
+        <w:rPr>
+          <w:rFonts w:ascii="Consolas" w:cs="Consolas" w:eastAsia="Consolas" w:hAnsi="Consolas"/>
+          <w:color w:val="A31515"/>
+        </w:rPr>
+        <w:t xml:space="preserve">SELECT</w:t>
+      </w:r>
+      <w:r>
+        <w:t xml:space="preserve"> → </w:t>
+      </w:r>
+      <w:r>
+        <w:rPr>
+          <w:rFonts w:ascii="Consolas" w:cs="Consolas" w:eastAsia="Consolas" w:hAnsi="Consolas"/>
+          <w:color w:val="A31515"/>
+        </w:rPr>
+        <w:t xml:space="preserve">FROM</w:t>
+      </w:r>
+      <w:r>
+        <w:t xml:space="preserve"> → </w:t>
+      </w:r>
+      <w:r>
+        <w:rPr>
+          <w:rFonts w:ascii="Consolas" w:cs="Consolas" w:eastAsia="Consolas" w:hAnsi="Consolas"/>
+          <w:color w:val="A31515"/>
+        </w:rPr>
+        <w:t xml:space="preserve">WHERE</w:t>
+      </w:r>
+      <w:r>
+        <w:t xml:space="preserve"> → </w:t>
+      </w:r>
+      <w:r>
+        <w:rPr>
+          <w:rFonts w:ascii="Consolas" w:cs="Consolas" w:eastAsia="Consolas" w:hAnsi="Consolas"/>
+          <w:color w:val="A31515"/>
+        </w:rPr>
+        <w:t xml:space="preserve">ORDER BY</w:t>
+      </w:r>
+      <w:r>
+        <w:t xml:space="preserve"> (o ORDER BY é sempre o último).</w:t>
+      </w:r>
+    </w:p>
+    <w:p>
+      <w:pPr>
+        <w:pStyle w:val="Heading2"/>
+      </w:pPr>
+      <w:r>
+        <w:t xml:space="preserve">3. UPDATE — alterar dados</w:t>
+      </w:r>
+    </w:p>
+    <w:p>
+      <w:pPr>
+        <w:pBdr>
+          <w:top w:val="single" w:color="BFBFBF" w:sz="4" w:space="4"/>
+        </w:pBdr>
+        <w:shd w:fill="F2F2F2" w:color="auto" w:val="clear"/>
+        <w:spacing w:after="0"/>
+        <w:ind w:left="200" w:right="200"/>
+      </w:pPr>
+      <w:r>
+        <w:rPr>
+          <w:rFonts w:ascii="Consolas" w:cs="Consolas" w:eastAsia="Consolas" w:hAnsi="Consolas"/>
+          <w:sz w:val="19"/>
+          <w:szCs w:val="19"/>
+        </w:rPr>
+        <w:t xml:space="preserve">UPDATE cargo</w:t>
+      </w:r>
+    </w:p>
+    <w:p>
+      <w:pPr>
+        <w:shd w:fill="F2F2F2" w:color="auto" w:val="clear"/>
+        <w:spacing w:after="0"/>
+        <w:ind w:left="200" w:right="200"/>
+      </w:pPr>
+      <w:r>
+        <w:rPr>
+          <w:rFonts w:ascii="Consolas" w:cs="Consolas" w:eastAsia="Consolas" w:hAnsi="Consolas"/>
+          <w:sz w:val="19"/>
+          <w:szCs w:val="19"/>
+        </w:rPr>
+        <w:t xml:space="preserve">SET valor = 2500</w:t>
+      </w:r>
+    </w:p>
+    <w:p>
+      <w:pPr>
+        <w:shd w:fill="F2F2F2" w:color="auto" w:val="clear"/>
+        <w:spacing w:after="0"/>
+        <w:ind w:left="200" w:right="200"/>
+      </w:pPr>
+      <w:r>
+        <w:rPr>
+          <w:rFonts w:ascii="Consolas" w:cs="Consolas" w:eastAsia="Consolas" w:hAnsi="Consolas"/>
+          <w:sz w:val="19"/>
+          <w:szCs w:val="19"/>
+        </w:rPr>
+        <w:t xml:space="preserve">WHERE id_cargo = 1;</w:t>
+      </w:r>
+    </w:p>
+    <w:p>
+      <w:pPr>
+        <w:shd w:fill="F2F2F2" w:color="auto" w:val="clear"/>
+        <w:spacing w:after="0"/>
+        <w:ind w:left="200" w:right="200"/>
+      </w:pPr>
+      <w:r>
+        <w:rPr>
+          <w:rFonts w:ascii="Consolas" w:cs="Consolas" w:eastAsia="Consolas" w:hAnsi="Consolas"/>
+          <w:sz w:val="19"/>
+          <w:szCs w:val="19"/>
+        </w:rPr>
+        <w:t xml:space="preserve"> </w:t>
+      </w:r>
+    </w:p>
+    <w:p>
+      <w:pPr>
+        <w:shd w:fill="F2F2F2" w:color="auto" w:val="clear"/>
+        <w:spacing w:after="0"/>
+        <w:ind w:left="200" w:right="200"/>
+      </w:pPr>
+      <w:r>
+        <w:rPr>
+          <w:rFonts w:ascii="Consolas" w:cs="Consolas" w:eastAsia="Consolas" w:hAnsi="Consolas"/>
+          <w:sz w:val="19"/>
+          <w:szCs w:val="19"/>
+        </w:rPr>
+        <w:t xml:space="preserve">-- várias colunas de uma vez: separar por vírgula</w:t>
+      </w:r>
+    </w:p>
+    <w:p>
+      <w:pPr>
+        <w:shd w:fill="F2F2F2" w:color="auto" w:val="clear"/>
+        <w:spacing w:after="0"/>
+        <w:ind w:left="200" w:right="200"/>
+      </w:pPr>
+      <w:r>
+        <w:rPr>
+          <w:rFonts w:ascii="Consolas" w:cs="Consolas" w:eastAsia="Consolas" w:hAnsi="Consolas"/>
+          <w:sz w:val="19"/>
+          <w:szCs w:val="19"/>
+        </w:rPr>
+        <w:t xml:space="preserve">UPDATE funcionario</w:t>
+      </w:r>
+    </w:p>
+    <w:p>
+      <w:pPr>
+        <w:shd w:fill="F2F2F2" w:color="auto" w:val="clear"/>
+        <w:spacing w:after="0"/>
+        <w:ind w:left="200" w:right="200"/>
+      </w:pPr>
+      <w:r>
+        <w:rPr>
+          <w:rFonts w:ascii="Consolas" w:cs="Consolas" w:eastAsia="Consolas" w:hAnsi="Consolas"/>
+          <w:sz w:val="19"/>
+          <w:szCs w:val="19"/>
+        </w:rPr>
+        <w:t xml:space="preserve">SET nome = 'GERALDO HENRIQUE NETO', escolaridade = 'MESTRE'</w:t>
+      </w:r>
+    </w:p>
+    <w:p>
+      <w:pPr>
+        <w:pBdr>
+          <w:bottom w:val="single" w:color="BFBFBF" w:sz="4" w:space="4"/>
+        </w:pBdr>
+        <w:shd w:fill="F2F2F2" w:color="auto" w:val="clear"/>
+        <w:spacing w:after="160"/>
+        <w:ind w:left="200" w:right="200"/>
+      </w:pPr>
+      <w:r>
+        <w:rPr>
+          <w:rFonts w:ascii="Consolas" w:cs="Consolas" w:eastAsia="Consolas" w:hAnsi="Consolas"/>
+          <w:sz w:val="19"/>
+          <w:szCs w:val="19"/>
+        </w:rPr>
+        <w:t xml:space="preserve">WHERE id_funcionario = 1;</w:t>
+      </w:r>
+    </w:p>
+    <w:p>
+      <w:pPr>
+        <w:pStyle w:val="Heading2"/>
+      </w:pPr>
+      <w:r>
+        <w:t xml:space="preserve">4. DELETE — excluir linhas</w:t>
+      </w:r>
+    </w:p>
+    <w:p>
+      <w:pPr>
+        <w:pBdr>
+          <w:top w:val="single" w:color="BFBFBF" w:sz="4" w:space="4"/>
+        </w:pBdr>
+        <w:shd w:fill="F2F2F2" w:color="auto" w:val="clear"/>
+        <w:spacing w:after="0"/>
+        <w:ind w:left="200" w:right="200"/>
+      </w:pPr>
+      <w:r>
+        <w:rPr>
+          <w:rFonts w:ascii="Consolas" w:cs="Consolas" w:eastAsia="Consolas" w:hAnsi="Consolas"/>
+          <w:sz w:val="19"/>
+          <w:szCs w:val="19"/>
+        </w:rPr>
+        <w:t xml:space="preserve">DELETE FROM cargo</w:t>
+      </w:r>
+    </w:p>
+    <w:p>
+      <w:pPr>
+        <w:shd w:fill="F2F2F2" w:color="auto" w:val="clear"/>
+        <w:spacing w:after="0"/>
+        <w:ind w:left="200" w:right="200"/>
+      </w:pPr>
+      <w:r>
+        <w:rPr>
+          <w:rFonts w:ascii="Consolas" w:cs="Consolas" w:eastAsia="Consolas" w:hAnsi="Consolas"/>
+          <w:sz w:val="19"/>
+          <w:szCs w:val="19"/>
+        </w:rPr>
+        <w:t xml:space="preserve">WHERE id_cargo = 7;</w:t>
+      </w:r>
+    </w:p>
+    <w:p>
+      <w:pPr>
+        <w:shd w:fill="F2F2F2" w:color="auto" w:val="clear"/>
+        <w:spacing w:after="0"/>
+        <w:ind w:left="200" w:right="200"/>
+      </w:pPr>
+      <w:r>
+        <w:rPr>
+          <w:rFonts w:ascii="Consolas" w:cs="Consolas" w:eastAsia="Consolas" w:hAnsi="Consolas"/>
+          <w:sz w:val="19"/>
+          <w:szCs w:val="19"/>
+        </w:rPr>
+        <w:t xml:space="preserve"> </w:t>
+      </w:r>
+    </w:p>
+    <w:p>
+      <w:pPr>
+        <w:shd w:fill="F2F2F2" w:color="auto" w:val="clear"/>
+        <w:spacing w:after="0"/>
+        <w:ind w:left="200" w:right="200"/>
+      </w:pPr>
+      <w:r>
+        <w:rPr>
+          <w:rFonts w:ascii="Consolas" w:cs="Consolas" w:eastAsia="Consolas" w:hAnsi="Consolas"/>
+          <w:sz w:val="19"/>
+          <w:szCs w:val="19"/>
+        </w:rPr>
+        <w:t xml:space="preserve">DELETE FROM cargo</w:t>
+      </w:r>
+    </w:p>
+    <w:p>
+      <w:pPr>
+        <w:shd w:fill="F2F2F2" w:color="auto" w:val="clear"/>
+        <w:spacing w:after="0"/>
+        <w:ind w:left="200" w:right="200"/>
+      </w:pPr>
+      <w:r>
+        <w:rPr>
+          <w:rFonts w:ascii="Consolas" w:cs="Consolas" w:eastAsia="Consolas" w:hAnsi="Consolas"/>
+          <w:sz w:val="19"/>
+          <w:szCs w:val="19"/>
+        </w:rPr>
+        <w:t xml:space="preserve">WHERE valor &gt; 7000</w:t>
+      </w:r>
+    </w:p>
+    <w:p>
+      <w:pPr>
+        <w:pBdr>
+          <w:bottom w:val="single" w:color="BFBFBF" w:sz="4" w:space="4"/>
+        </w:pBdr>
+        <w:shd w:fill="F2F2F2" w:color="auto" w:val="clear"/>
+        <w:spacing w:after="160"/>
+        <w:ind w:left="200" w:right="200"/>
+      </w:pPr>
+      <w:r>
+        <w:rPr>
+          <w:rFonts w:ascii="Consolas" w:cs="Consolas" w:eastAsia="Consolas" w:hAnsi="Consolas"/>
+          <w:sz w:val="19"/>
+          <w:szCs w:val="19"/>
+        </w:rPr>
+        <w:t xml:space="preserve">   OR valor &lt; 100;</w:t>
+      </w:r>
+    </w:p>
+    <w:p>
+      <w:pPr>
+        <w:pBdr>
+          <w:left w:val="single" w:color="E0A800" w:sz="24" w:space="8"/>
+        </w:pBdr>
+        <w:shd w:fill="FFF4CE" w:color="auto" w:val="clear"/>
+        <w:spacing w:after="0" w:before="120"/>
+      </w:pPr>
+      <w:r>
+        <w:rPr>
+          <w:b/>
+          <w:bCs/>
+        </w:rPr>
+        <w:t xml:space="preserve">A "bomba" do professor</w:t>
+      </w:r>
+    </w:p>
+    <w:p>
+      <w:pPr>
+        <w:pBdr>
+          <w:left w:val="single" w:color="E0A800" w:sz="24" w:space="8"/>
+        </w:pBdr>
+        <w:shd w:fill="FFF4CE" w:color="auto" w:val="clear"/>
+        <w:spacing w:after="0"/>
+      </w:pPr>
+      <w:r>
+        <w:t xml:space="preserve">• </w:t>
+      </w:r>
+      <w:r>
+        <w:rPr>
+          <w:rFonts w:ascii="Consolas" w:cs="Consolas" w:eastAsia="Consolas" w:hAnsi="Consolas"/>
+          <w:color w:val="A31515"/>
+        </w:rPr>
+        <w:t xml:space="preserve">UPDATE</w:t>
+      </w:r>
+      <w:r>
+        <w:t xml:space="preserve"> ou </w:t>
+      </w:r>
+      <w:r>
+        <w:rPr>
+          <w:rFonts w:ascii="Consolas" w:cs="Consolas" w:eastAsia="Consolas" w:hAnsi="Consolas"/>
+          <w:color w:val="A31515"/>
+        </w:rPr>
+        <w:t xml:space="preserve">DELETE</w:t>
+      </w:r>
+      <w:r>
+        <w:t xml:space="preserve"> </w:t>
+      </w:r>
+      <w:r>
+        <w:rPr>
+          <w:b/>
+          <w:bCs/>
+        </w:rPr>
+        <w:t xml:space="preserve">sem WHERE</w:t>
+      </w:r>
+      <w:r>
+        <w:t xml:space="preserve"> atinge </w:t>
+      </w:r>
+      <w:r>
+        <w:rPr>
+          <w:b/>
+          <w:bCs/>
+        </w:rPr>
+        <w:t xml:space="preserve">TODAS as linhas</w:t>
+      </w:r>
+      <w:r>
+        <w:t xml:space="preserve"> da tabela.</w:t>
+      </w:r>
+    </w:p>
+    <w:p>
+      <w:pPr>
+        <w:pBdr>
+          <w:left w:val="single" w:color="E0A800" w:sz="24" w:space="8"/>
+        </w:pBdr>
+        <w:shd w:fill="FFF4CE" w:color="auto" w:val="clear"/>
+        <w:spacing w:after="0"/>
+      </w:pPr>
+      <w:r>
+        <w:t xml:space="preserve">• </w:t>
+      </w:r>
+      <w:r>
+        <w:rPr>
+          <w:rFonts w:ascii="Consolas" w:cs="Consolas" w:eastAsia="Consolas" w:hAnsi="Consolas"/>
+          <w:color w:val="A31515"/>
+        </w:rPr>
+        <w:t xml:space="preserve">UPDATE cargo SET valor = 5000;</w:t>
+      </w:r>
+      <w:r>
+        <w:t xml:space="preserve"> → todos os cargos passam a valer 5000.</w:t>
+      </w:r>
+    </w:p>
+    <w:p>
+      <w:pPr>
+        <w:pBdr>
+          <w:left w:val="single" w:color="E0A800" w:sz="24" w:space="8"/>
+        </w:pBdr>
+        <w:shd w:fill="FFF4CE" w:color="auto" w:val="clear"/>
+        <w:spacing w:after="0"/>
+      </w:pPr>
+      <w:r>
+        <w:t xml:space="preserve">• </w:t>
+      </w:r>
+      <w:r>
+        <w:rPr>
+          <w:rFonts w:ascii="Consolas" w:cs="Consolas" w:eastAsia="Consolas" w:hAnsi="Consolas"/>
+          <w:color w:val="A31515"/>
+        </w:rPr>
+        <w:t xml:space="preserve">DELETE FROM cargo;</w:t>
+      </w:r>
+      <w:r>
+        <w:t xml:space="preserve"> → apaga todos os cargos.</w:t>
+      </w:r>
+    </w:p>
+    <w:p>
+      <w:pPr>
+        <w:pBdr>
+          <w:left w:val="single" w:color="E0A800" w:sz="24" w:space="8"/>
+        </w:pBdr>
+        <w:shd w:fill="FFF4CE" w:color="auto" w:val="clear"/>
+        <w:spacing w:after="0"/>
+      </w:pPr>
+      <w:r>
+        <w:t xml:space="preserve">• </w:t>
+      </w:r>
+      <w:r>
+        <w:t xml:space="preserve">Boa prática: antes, rode um </w:t>
+      </w:r>
+      <w:r>
+        <w:rPr>
+          <w:b/>
+          <w:bCs/>
+        </w:rPr>
+        <w:t xml:space="preserve">SELECT com o mesmo WHERE</w:t>
+      </w:r>
+      <w:r>
+        <w:t xml:space="preserve"> e confira quais linhas serão afetadas.</w:t>
+      </w:r>
+    </w:p>
+    <w:p>
+      <w:pPr>
+        <w:pBdr>
+          <w:left w:val="single" w:color="E0A800" w:sz="24" w:space="8"/>
+        </w:pBdr>
+        <w:shd w:fill="FFF4CE" w:color="auto" w:val="clear"/>
+        <w:spacing w:after="200"/>
+      </w:pPr>
+      <w:r>
+        <w:t xml:space="preserve">• </w:t>
+      </w:r>
+      <w:r>
+        <w:t xml:space="preserve">Filtre pela </w:t>
+      </w:r>
+      <w:r>
+        <w:rPr>
+          <w:b/>
+          <w:bCs/>
+        </w:rPr>
+        <w:t xml:space="preserve">chave primária</w:t>
+      </w:r>
+      <w:r>
+        <w:t xml:space="preserve"> (</w:t>
+      </w:r>
+      <w:r>
+        <w:rPr>
+          <w:rFonts w:ascii="Consolas" w:cs="Consolas" w:eastAsia="Consolas" w:hAnsi="Consolas"/>
+          <w:color w:val="A31515"/>
+        </w:rPr>
+        <w:t xml:space="preserve">WHERE id = ...</w:t>
+      </w:r>
+      <w:r>
+        <w:t xml:space="preserve">) quando quiser mexer em uma linha só: ela nunca se repete.</w:t>
       </w:r>
     </w:p>
     <w:sectPr>

</xml_diff>

<commit_message>
Resumo: DELETE x DROP e erros comuns da Aula 02
Co-Authored-By: Claude Opus 5.5 <noreply@anthropic.com>
Claude-Session: https://claude.ai/code/session_01CYs6vUMBFtjcCxFJC5XwZi
</commit_message>
<xml_diff>
--- a/Resumo_Banco_de_Dados.docx
+++ b/Resumo_Banco_de_Dados.docx
@@ -3636,6 +3636,678 @@
       </w:r>
       <w:r>
         <w:t xml:space="preserve">) quando quiser mexer em uma linha só: ela nunca se repete.</w:t>
+      </w:r>
+    </w:p>
+    <w:p>
+      <w:pPr>
+        <w:pStyle w:val="Heading2"/>
+      </w:pPr>
+      <w:r>
+        <w:t xml:space="preserve">5. DELETE x DROP TABLE</w:t>
+      </w:r>
+    </w:p>
+    <w:tbl>
+      <w:tblPr>
+        <w:tblW w:type="dxa" w:w="9026"/>
+        <w:tblBorders>
+          <w:top w:val="single" w:color="auto" w:sz="4"/>
+          <w:left w:val="single" w:color="auto" w:sz="4"/>
+          <w:bottom w:val="single" w:color="auto" w:sz="4"/>
+          <w:right w:val="single" w:color="auto" w:sz="4"/>
+          <w:insideH w:val="single" w:color="auto" w:sz="4"/>
+          <w:insideV w:val="single" w:color="auto" w:sz="4"/>
+        </w:tblBorders>
+      </w:tblPr>
+      <w:tblGrid>
+        <w:gridCol w:w="3249"/>
+        <w:gridCol w:w="3610"/>
+        <w:gridCol w:w="2167"/>
+      </w:tblGrid>
+      <w:tr>
+        <w:trPr>
+          <w:tblHeader/>
+        </w:trPr>
+        <w:tc>
+          <w:tcPr>
+            <w:tcW w:type="dxa" w:w="3249"/>
+            <w:shd w:fill="1F4E79" w:color="auto" w:val="clear"/>
+            <w:tcMar>
+              <w:top w:type="dxa" w:w="60"/>
+              <w:left w:type="dxa" w:w="100"/>
+              <w:bottom w:type="dxa" w:w="60"/>
+              <w:right w:type="dxa" w:w="100"/>
+            </w:tcMar>
+          </w:tcPr>
+          <w:p>
+            <w:r>
+              <w:rPr>
+                <w:b/>
+                <w:bCs/>
+                <w:color w:val="FFFFFF"/>
+              </w:rPr>
+              <w:t xml:space="preserve">Comando</w:t>
+            </w:r>
+          </w:p>
+        </w:tc>
+        <w:tc>
+          <w:tcPr>
+            <w:tcW w:type="dxa" w:w="3610"/>
+            <w:shd w:fill="1F4E79" w:color="auto" w:val="clear"/>
+            <w:tcMar>
+              <w:top w:type="dxa" w:w="60"/>
+              <w:left w:type="dxa" w:w="100"/>
+              <w:bottom w:type="dxa" w:w="60"/>
+              <w:right w:type="dxa" w:w="100"/>
+            </w:tcMar>
+          </w:tcPr>
+          <w:p>
+            <w:r>
+              <w:rPr>
+                <w:b/>
+                <w:bCs/>
+                <w:color w:val="FFFFFF"/>
+              </w:rPr>
+              <w:t xml:space="preserve">É como no Excel...</w:t>
+            </w:r>
+          </w:p>
+        </w:tc>
+        <w:tc>
+          <w:tcPr>
+            <w:tcW w:type="dxa" w:w="2167"/>
+            <w:shd w:fill="1F4E79" w:color="auto" w:val="clear"/>
+            <w:tcMar>
+              <w:top w:type="dxa" w:w="60"/>
+              <w:left w:type="dxa" w:w="100"/>
+              <w:bottom w:type="dxa" w:w="60"/>
+              <w:right w:type="dxa" w:w="100"/>
+            </w:tcMar>
+          </w:tcPr>
+          <w:p>
+            <w:r>
+              <w:rPr>
+                <w:b/>
+                <w:bCs/>
+                <w:color w:val="FFFFFF"/>
+              </w:rPr>
+              <w:t xml:space="preserve">O que sobra</w:t>
+            </w:r>
+          </w:p>
+        </w:tc>
+      </w:tr>
+      <w:tr>
+        <w:trPr>
+          <w:tblHeader w:val="off"/>
+        </w:trPr>
+        <w:tc>
+          <w:tcPr>
+            <w:tcW w:type="dxa" w:w="3249"/>
+            <w:tcMar>
+              <w:top w:type="dxa" w:w="60"/>
+              <w:left w:type="dxa" w:w="100"/>
+              <w:bottom w:type="dxa" w:w="60"/>
+              <w:right w:type="dxa" w:w="100"/>
+            </w:tcMar>
+          </w:tcPr>
+          <w:p>
+            <w:r>
+              <w:rPr>
+                <w:rFonts w:ascii="Consolas" w:cs="Consolas" w:eastAsia="Consolas" w:hAnsi="Consolas"/>
+                <w:color w:val="A31515"/>
+              </w:rPr>
+              <w:t xml:space="preserve">DELETE FROM tabela;</w:t>
+            </w:r>
+          </w:p>
+        </w:tc>
+        <w:tc>
+          <w:tcPr>
+            <w:tcW w:type="dxa" w:w="3610"/>
+            <w:tcMar>
+              <w:top w:type="dxa" w:w="60"/>
+              <w:left w:type="dxa" w:w="100"/>
+              <w:bottom w:type="dxa" w:w="60"/>
+              <w:right w:type="dxa" w:w="100"/>
+            </w:tcMar>
+          </w:tcPr>
+          <w:p>
+            <w:r>
+              <w:t xml:space="preserve">apagar todas as linhas, mantendo o cabeçalho</w:t>
+            </w:r>
+          </w:p>
+        </w:tc>
+        <w:tc>
+          <w:tcPr>
+            <w:tcW w:type="dxa" w:w="2167"/>
+            <w:tcMar>
+              <w:top w:type="dxa" w:w="60"/>
+              <w:left w:type="dxa" w:w="100"/>
+              <w:bottom w:type="dxa" w:w="60"/>
+              <w:right w:type="dxa" w:w="100"/>
+            </w:tcMar>
+          </w:tcPr>
+          <w:p>
+            <w:r>
+              <w:t xml:space="preserve">a tabela, </w:t>
+            </w:r>
+            <w:r>
+              <w:rPr>
+                <w:b/>
+                <w:bCs/>
+              </w:rPr>
+              <w:t xml:space="preserve">vazia</w:t>
+            </w:r>
+          </w:p>
+        </w:tc>
+      </w:tr>
+      <w:tr>
+        <w:trPr>
+          <w:tblHeader w:val="off"/>
+        </w:trPr>
+        <w:tc>
+          <w:tcPr>
+            <w:tcW w:type="dxa" w:w="3249"/>
+            <w:tcMar>
+              <w:top w:type="dxa" w:w="60"/>
+              <w:left w:type="dxa" w:w="100"/>
+              <w:bottom w:type="dxa" w:w="60"/>
+              <w:right w:type="dxa" w:w="100"/>
+            </w:tcMar>
+          </w:tcPr>
+          <w:p>
+            <w:r>
+              <w:rPr>
+                <w:rFonts w:ascii="Consolas" w:cs="Consolas" w:eastAsia="Consolas" w:hAnsi="Consolas"/>
+                <w:color w:val="A31515"/>
+              </w:rPr>
+              <w:t xml:space="preserve">DELETE FROM tabela WHERE ...;</w:t>
+            </w:r>
+          </w:p>
+        </w:tc>
+        <w:tc>
+          <w:tcPr>
+            <w:tcW w:type="dxa" w:w="3610"/>
+            <w:tcMar>
+              <w:top w:type="dxa" w:w="60"/>
+              <w:left w:type="dxa" w:w="100"/>
+              <w:bottom w:type="dxa" w:w="60"/>
+              <w:right w:type="dxa" w:w="100"/>
+            </w:tcMar>
+          </w:tcPr>
+          <w:p>
+            <w:r>
+              <w:t xml:space="preserve">apagar só as linhas filtradas</w:t>
+            </w:r>
+          </w:p>
+        </w:tc>
+        <w:tc>
+          <w:tcPr>
+            <w:tcW w:type="dxa" w:w="2167"/>
+            <w:tcMar>
+              <w:top w:type="dxa" w:w="60"/>
+              <w:left w:type="dxa" w:w="100"/>
+              <w:bottom w:type="dxa" w:w="60"/>
+              <w:right w:type="dxa" w:w="100"/>
+            </w:tcMar>
+          </w:tcPr>
+          <w:p>
+            <w:r>
+              <w:t xml:space="preserve">a tabela e as outras linhas</w:t>
+            </w:r>
+          </w:p>
+        </w:tc>
+      </w:tr>
+      <w:tr>
+        <w:trPr>
+          <w:tblHeader w:val="off"/>
+        </w:trPr>
+        <w:tc>
+          <w:tcPr>
+            <w:tcW w:type="dxa" w:w="3249"/>
+            <w:tcMar>
+              <w:top w:type="dxa" w:w="60"/>
+              <w:left w:type="dxa" w:w="100"/>
+              <w:bottom w:type="dxa" w:w="60"/>
+              <w:right w:type="dxa" w:w="100"/>
+            </w:tcMar>
+          </w:tcPr>
+          <w:p>
+            <w:r>
+              <w:rPr>
+                <w:rFonts w:ascii="Consolas" w:cs="Consolas" w:eastAsia="Consolas" w:hAnsi="Consolas"/>
+                <w:color w:val="A31515"/>
+              </w:rPr>
+              <w:t xml:space="preserve">DROP TABLE tabela;</w:t>
+            </w:r>
+          </w:p>
+        </w:tc>
+        <w:tc>
+          <w:tcPr>
+            <w:tcW w:type="dxa" w:w="3610"/>
+            <w:tcMar>
+              <w:top w:type="dxa" w:w="60"/>
+              <w:left w:type="dxa" w:w="100"/>
+              <w:bottom w:type="dxa" w:w="60"/>
+              <w:right w:type="dxa" w:w="100"/>
+            </w:tcMar>
+          </w:tcPr>
+          <w:p>
+            <w:r>
+              <w:t xml:space="preserve">excluir a aba inteira</w:t>
+            </w:r>
+          </w:p>
+        </w:tc>
+        <w:tc>
+          <w:tcPr>
+            <w:tcW w:type="dxa" w:w="2167"/>
+            <w:tcMar>
+              <w:top w:type="dxa" w:w="60"/>
+              <w:left w:type="dxa" w:w="100"/>
+              <w:bottom w:type="dxa" w:w="60"/>
+              <w:right w:type="dxa" w:w="100"/>
+            </w:tcMar>
+          </w:tcPr>
+          <w:p>
+            <w:r>
+              <w:rPr>
+                <w:b/>
+                <w:bCs/>
+              </w:rPr>
+              <w:t xml:space="preserve">nada</w:t>
+            </w:r>
+          </w:p>
+        </w:tc>
+      </w:tr>
+    </w:tbl>
+    <w:p>
+      <w:pPr>
+        <w:spacing w:after="120"/>
+      </w:pPr>
+    </w:p>
+    <w:p>
+      <w:pPr>
+        <w:pBdr>
+          <w:left w:val="single" w:color="E0A800" w:sz="24" w:space="8"/>
+        </w:pBdr>
+        <w:shd w:fill="FFF4CE" w:color="auto" w:val="clear"/>
+        <w:spacing w:after="0" w:before="120"/>
+      </w:pPr>
+      <w:r>
+        <w:rPr>
+          <w:b/>
+          <w:bCs/>
+        </w:rPr>
+        <w:t xml:space="preserve">Erros que apareceram nos exercícios (revise antes da prova!)</w:t>
+      </w:r>
+    </w:p>
+    <w:p>
+      <w:pPr>
+        <w:pBdr>
+          <w:left w:val="single" w:color="E0A800" w:sz="24" w:space="8"/>
+        </w:pBdr>
+        <w:shd w:fill="FFF4CE" w:color="auto" w:val="clear"/>
+        <w:spacing w:after="0"/>
+      </w:pPr>
+      <w:r>
+        <w:t xml:space="preserve">• </w:t>
+      </w:r>
+      <w:r>
+        <w:rPr>
+          <w:rFonts w:ascii="Consolas" w:cs="Consolas" w:eastAsia="Consolas" w:hAnsi="Consolas"/>
+          <w:color w:val="A31515"/>
+        </w:rPr>
+        <w:t xml:space="preserve">SELECT FROM tabela</w:t>
+      </w:r>
+      <w:r>
+        <w:t xml:space="preserve"> (sem colunas) não dá erro, mas não mostra nada. Use </w:t>
+      </w:r>
+      <w:r>
+        <w:rPr>
+          <w:rFonts w:ascii="Consolas" w:cs="Consolas" w:eastAsia="Consolas" w:hAnsi="Consolas"/>
+          <w:color w:val="A31515"/>
+        </w:rPr>
+        <w:t xml:space="preserve">*</w:t>
+      </w:r>
+      <w:r>
+        <w:t xml:space="preserve"> ou liste as colunas.</w:t>
+      </w:r>
+    </w:p>
+    <w:p>
+      <w:pPr>
+        <w:pBdr>
+          <w:left w:val="single" w:color="E0A800" w:sz="24" w:space="8"/>
+        </w:pBdr>
+        <w:shd w:fill="FFF4CE" w:color="auto" w:val="clear"/>
+        <w:spacing w:after="0"/>
+      </w:pPr>
+      <w:r>
+        <w:t xml:space="preserve">• </w:t>
+      </w:r>
+      <w:r>
+        <w:rPr>
+          <w:rFonts w:ascii="Consolas" w:cs="Consolas" w:eastAsia="Consolas" w:hAnsi="Consolas"/>
+          <w:color w:val="A31515"/>
+        </w:rPr>
+        <w:t xml:space="preserve">;</w:t>
+      </w:r>
+      <w:r>
+        <w:t xml:space="preserve"> no meio do comando: </w:t>
+      </w:r>
+      <w:r>
+        <w:rPr>
+          <w:rFonts w:ascii="Consolas" w:cs="Consolas" w:eastAsia="Consolas" w:hAnsi="Consolas"/>
+          <w:color w:val="A31515"/>
+        </w:rPr>
+        <w:t xml:space="preserve">SELECT ... ;</w:t>
+      </w:r>
+      <w:r>
+        <w:t xml:space="preserve"> e depois </w:t>
+      </w:r>
+      <w:r>
+        <w:rPr>
+          <w:rFonts w:ascii="Consolas" w:cs="Consolas" w:eastAsia="Consolas" w:hAnsi="Consolas"/>
+          <w:color w:val="A31515"/>
+        </w:rPr>
+        <w:t xml:space="preserve">WHERE ...</w:t>
+      </w:r>
+      <w:r>
+        <w:t xml:space="preserve"> → erro perto do WHERE. Um </w:t>
+      </w:r>
+      <w:r>
+        <w:rPr>
+          <w:rFonts w:ascii="Consolas" w:cs="Consolas" w:eastAsia="Consolas" w:hAnsi="Consolas"/>
+          <w:color w:val="A31515"/>
+        </w:rPr>
+        <w:t xml:space="preserve">;</w:t>
+      </w:r>
+      <w:r>
+        <w:t xml:space="preserve"> só, no </w:t>
+      </w:r>
+      <w:r>
+        <w:rPr>
+          <w:b/>
+          <w:bCs/>
+        </w:rPr>
+        <w:t xml:space="preserve">final</w:t>
+      </w:r>
+      <w:r>
+        <w:t xml:space="preserve">.</w:t>
+      </w:r>
+    </w:p>
+    <w:p>
+      <w:pPr>
+        <w:pBdr>
+          <w:left w:val="single" w:color="E0A800" w:sz="24" w:space="8"/>
+        </w:pBdr>
+        <w:shd w:fill="FFF4CE" w:color="auto" w:val="clear"/>
+        <w:spacing w:after="0"/>
+      </w:pPr>
+      <w:r>
+        <w:t xml:space="preserve">• </w:t>
+      </w:r>
+      <w:r>
+        <w:t xml:space="preserve">Dois comandos sem </w:t>
+      </w:r>
+      <w:r>
+        <w:rPr>
+          <w:rFonts w:ascii="Consolas" w:cs="Consolas" w:eastAsia="Consolas" w:hAnsi="Consolas"/>
+          <w:color w:val="A31515"/>
+        </w:rPr>
+        <w:t xml:space="preserve">;</w:t>
+      </w:r>
+      <w:r>
+        <w:t xml:space="preserve"> entre eles → o banco "gruda" os dois e dá erro de sintaxe.</w:t>
+      </w:r>
+    </w:p>
+    <w:p>
+      <w:pPr>
+        <w:pBdr>
+          <w:left w:val="single" w:color="E0A800" w:sz="24" w:space="8"/>
+        </w:pBdr>
+        <w:shd w:fill="FFF4CE" w:color="auto" w:val="clear"/>
+        <w:spacing w:after="0"/>
+      </w:pPr>
+      <w:r>
+        <w:t xml:space="preserve">• </w:t>
+      </w:r>
+      <w:r>
+        <w:rPr>
+          <w:rFonts w:ascii="Consolas" w:cs="Consolas" w:eastAsia="Consolas" w:hAnsi="Consolas"/>
+          <w:color w:val="A31515"/>
+        </w:rPr>
+        <w:t xml:space="preserve">ORDER BY DESC</w:t>
+      </w:r>
+      <w:r>
+        <w:t xml:space="preserve"> → falta a coluna. Certo: </w:t>
+      </w:r>
+      <w:r>
+        <w:rPr>
+          <w:rFonts w:ascii="Consolas" w:cs="Consolas" w:eastAsia="Consolas" w:hAnsi="Consolas"/>
+          <w:color w:val="A31515"/>
+        </w:rPr>
+        <w:t xml:space="preserve">ORDER BY valor DESC</w:t>
+      </w:r>
+      <w:r>
+        <w:t xml:space="preserve">.</w:t>
+      </w:r>
+    </w:p>
+    <w:p>
+      <w:pPr>
+        <w:pBdr>
+          <w:left w:val="single" w:color="E0A800" w:sz="24" w:space="8"/>
+        </w:pBdr>
+        <w:shd w:fill="FFF4CE" w:color="auto" w:val="clear"/>
+        <w:spacing w:after="0"/>
+      </w:pPr>
+      <w:r>
+        <w:t xml:space="preserve">• </w:t>
+      </w:r>
+      <w:r>
+        <w:rPr>
+          <w:rFonts w:ascii="Consolas" w:cs="Consolas" w:eastAsia="Consolas" w:hAnsi="Consolas"/>
+          <w:color w:val="A31515"/>
+        </w:rPr>
+        <w:t xml:space="preserve">WHERE x = 'A' OR 'B'</w:t>
+      </w:r>
+      <w:r>
+        <w:t xml:space="preserve"> → errado. Cada lado do OR é uma condição completa: </w:t>
+      </w:r>
+      <w:r>
+        <w:rPr>
+          <w:rFonts w:ascii="Consolas" w:cs="Consolas" w:eastAsia="Consolas" w:hAnsi="Consolas"/>
+          <w:color w:val="A31515"/>
+        </w:rPr>
+        <w:t xml:space="preserve">x = 'A' OR x = 'B'</w:t>
+      </w:r>
+      <w:r>
+        <w:t xml:space="preserve">.</w:t>
+      </w:r>
+    </w:p>
+    <w:p>
+      <w:pPr>
+        <w:pBdr>
+          <w:left w:val="single" w:color="E0A800" w:sz="24" w:space="8"/>
+        </w:pBdr>
+        <w:shd w:fill="FFF4CE" w:color="auto" w:val="clear"/>
+        <w:spacing w:after="0"/>
+      </w:pPr>
+      <w:r>
+        <w:t xml:space="preserve">• </w:t>
+      </w:r>
+      <w:r>
+        <w:rPr>
+          <w:rFonts w:ascii="Consolas" w:cs="Consolas" w:eastAsia="Consolas" w:hAnsi="Consolas"/>
+          <w:color w:val="A31515"/>
+        </w:rPr>
+        <w:t xml:space="preserve">WHERE x = 'A' IN 'B'</w:t>
+      </w:r>
+      <w:r>
+        <w:t xml:space="preserve"> → errado. O IN usa lista entre parênteses: </w:t>
+      </w:r>
+      <w:r>
+        <w:rPr>
+          <w:rFonts w:ascii="Consolas" w:cs="Consolas" w:eastAsia="Consolas" w:hAnsi="Consolas"/>
+          <w:color w:val="A31515"/>
+        </w:rPr>
+        <w:t xml:space="preserve">x IN ('A', 'B')</w:t>
+      </w:r>
+      <w:r>
+        <w:t xml:space="preserve">.</w:t>
+      </w:r>
+    </w:p>
+    <w:p>
+      <w:pPr>
+        <w:pBdr>
+          <w:left w:val="single" w:color="E0A800" w:sz="24" w:space="8"/>
+        </w:pBdr>
+        <w:shd w:fill="FFF4CE" w:color="auto" w:val="clear"/>
+        <w:spacing w:after="0"/>
+      </w:pPr>
+      <w:r>
+        <w:t xml:space="preserve">• </w:t>
+      </w:r>
+      <w:r>
+        <w:t xml:space="preserve">Em </w:t>
+      </w:r>
+      <w:r>
+        <w:rPr>
+          <w:rFonts w:ascii="Consolas" w:cs="Consolas" w:eastAsia="Consolas" w:hAnsi="Consolas"/>
+          <w:color w:val="A31515"/>
+        </w:rPr>
+        <w:t xml:space="preserve">ORDER BY escolaridade, nome ASC</w:t>
+      </w:r>
+      <w:r>
+        <w:t xml:space="preserve"> o </w:t>
+      </w:r>
+      <w:r>
+        <w:rPr>
+          <w:rFonts w:ascii="Consolas" w:cs="Consolas" w:eastAsia="Consolas" w:hAnsi="Consolas"/>
+          <w:color w:val="A31515"/>
+        </w:rPr>
+        <w:t xml:space="preserve">ASC</w:t>
+      </w:r>
+      <w:r>
+        <w:t xml:space="preserve"> vale </w:t>
+      </w:r>
+      <w:r>
+        <w:rPr>
+          <w:b/>
+          <w:bCs/>
+        </w:rPr>
+        <w:t xml:space="preserve">só para nome</w:t>
+      </w:r>
+      <w:r>
+        <w:t xml:space="preserve">: cada coluna tem sua direção.</w:t>
+      </w:r>
+    </w:p>
+    <w:p>
+      <w:pPr>
+        <w:pBdr>
+          <w:left w:val="single" w:color="E0A800" w:sz="24" w:space="8"/>
+        </w:pBdr>
+        <w:shd w:fill="FFF4CE" w:color="auto" w:val="clear"/>
+        <w:spacing w:after="0"/>
+      </w:pPr>
+      <w:r>
+        <w:t xml:space="preserve">• </w:t>
+      </w:r>
+      <w:r>
+        <w:rPr>
+          <w:rFonts w:ascii="Consolas" w:cs="Consolas" w:eastAsia="Consolas" w:hAnsi="Consolas"/>
+          <w:color w:val="A31515"/>
+        </w:rPr>
+        <w:t xml:space="preserve">DELETE * FROM</w:t>
+      </w:r>
+      <w:r>
+        <w:t xml:space="preserve"> → errado. O DELETE apaga sempre a linha inteira, então não leva </w:t>
+      </w:r>
+      <w:r>
+        <w:rPr>
+          <w:rFonts w:ascii="Consolas" w:cs="Consolas" w:eastAsia="Consolas" w:hAnsi="Consolas"/>
+          <w:color w:val="A31515"/>
+        </w:rPr>
+        <w:t xml:space="preserve">*</w:t>
+      </w:r>
+      <w:r>
+        <w:t xml:space="preserve">.</w:t>
+      </w:r>
+    </w:p>
+    <w:p>
+      <w:pPr>
+        <w:pBdr>
+          <w:left w:val="single" w:color="E0A800" w:sz="24" w:space="8"/>
+        </w:pBdr>
+        <w:shd w:fill="FFF4CE" w:color="auto" w:val="clear"/>
+        <w:spacing w:after="0"/>
+      </w:pPr>
+      <w:r>
+        <w:t xml:space="preserve">• </w:t>
+      </w:r>
+      <w:r>
+        <w:t xml:space="preserve">Número vai </w:t>
+      </w:r>
+      <w:r>
+        <w:rPr>
+          <w:b/>
+          <w:bCs/>
+        </w:rPr>
+        <w:t xml:space="preserve">sem aspas</w:t>
+      </w:r>
+      <w:r>
+        <w:t xml:space="preserve">: </w:t>
+      </w:r>
+      <w:r>
+        <w:rPr>
+          <w:rFonts w:ascii="Consolas" w:cs="Consolas" w:eastAsia="Consolas" w:hAnsi="Consolas"/>
+          <w:color w:val="A31515"/>
+        </w:rPr>
+        <w:t xml:space="preserve">WHERE id = 5</w:t>
+      </w:r>
+      <w:r>
+        <w:t xml:space="preserve"> (e não </w:t>
+      </w:r>
+      <w:r>
+        <w:rPr>
+          <w:rFonts w:ascii="Consolas" w:cs="Consolas" w:eastAsia="Consolas" w:hAnsi="Consolas"/>
+          <w:color w:val="A31515"/>
+        </w:rPr>
+        <w:t xml:space="preserve">'5'</w:t>
+      </w:r>
+      <w:r>
+        <w:t xml:space="preserve">).</w:t>
+      </w:r>
+    </w:p>
+    <w:p>
+      <w:pPr>
+        <w:pBdr>
+          <w:left w:val="single" w:color="E0A800" w:sz="24" w:space="8"/>
+        </w:pBdr>
+        <w:shd w:fill="FFF4CE" w:color="auto" w:val="clear"/>
+        <w:spacing w:after="200"/>
+      </w:pPr>
+      <w:r>
+        <w:t xml:space="preserve">• </w:t>
+      </w:r>
+      <w:r>
+        <w:t xml:space="preserve">No SQL Editor, com a lista de sugestões aberta, o </w:t>
+      </w:r>
+      <w:r>
+        <w:rPr>
+          <w:b/>
+          <w:bCs/>
+        </w:rPr>
+        <w:t xml:space="preserve">Enter aceita a sugestão</w:t>
+      </w:r>
+      <w:r>
+        <w:t xml:space="preserve">. Aperte </w:t>
+      </w:r>
+      <w:r>
+        <w:rPr>
+          <w:b/>
+          <w:bCs/>
+        </w:rPr>
+        <w:t xml:space="preserve">Esc</w:t>
+      </w:r>
+      <w:r>
+        <w:t xml:space="preserve"> antes.</w:t>
       </w:r>
     </w:p>
     <w:sectPr>

</xml_diff>